<commit_message>
Rewrite SOLAS tender response in Stacked Ltd house style
Rebuild Criterion 1 (Project Approach) and Criterion 3 (Proposed Team &
Contract Management) using Stacked Ltd's actual named personnel,
ConnectWise service desk, four-tier escalation, response-time and PPM
commitments, and stage-gated install methodology, adapted from the TCD
and DETE reference responses to the SOLAS Castleforbes House context.

Co-Authored-By: Claude Opus 4.8 <noreply@anthropic.com>
Claude-Session: https://claude.ai/code/session_0168ZXfBVpgHqiSNDmoMzbrE
</commit_message>
<xml_diff>
--- a/SOLAS_Tender_Response.docx
+++ b/SOLAS_Tender_Response.docx
@@ -103,11 +103,10 @@
       </w:pPr>
       <w:r>
         <w:rPr>
-          <w:i/>
-          <w:color w:val="C00000"/>
-          <w:sz w:val="24"/>
+          <w:b/>
+          <w:sz w:val="26"/>
         </w:rPr>
-        <w:t>Submitted by: [Company Name]</w:t>
+        <w:t>Submitted by: Stacked Ltd</w:t>
       </w:r>
     </w:p>
     <w:p>
@@ -122,7 +121,7 @@
           <w:color w:val="606060"/>
           <w:sz w:val="20"/>
         </w:rPr>
-        <w:t>This response addresses Award Criterion 1 (Project Approach) and Award Criterion 3 (Proposed Team and Contract Management) as set out in Section 2.5 of the Descriptive Document. Award Criterion 2 (Proposed Solution) and Award Criterion 4 (Cost) are provided separately.</w:t>
+        <w:t>This document constitutes Stacked Ltd’s tender response addressing Award Criterion 1 (Project Approach) and Award Criterion 3 (Proposed Team and Contract Management) as set out in Section 2.5 of the Descriptive Document. Award Criterion 2 (Proposed Solution) and Award Criterion 4 (Cost) are provided separately.</w:t>
       </w:r>
     </w:p>
     <w:p>
@@ -135,7 +134,47 @@
     </w:p>
     <w:p>
       <w:r>
-        <w:t>[Company Name] understands that SOLAS requires a standardised, user-friendly and accessible audio-visual solution to be delivered across the meeting rooms, event spaces and communal areas of Castleforbes House with minimal disruption to a live, occupied office environment. Our project approach is built around four principles: standardisation across all rooms, seamless integration with the existing Microsoft 365 / Microsoft Teams and Clearooms environment, accessibility for all users, and a phased delivery that protects day-to-day SOLAS operations.</w:t>
+        <w:t>Stacked Ltd understands that SOLAS requires a standardised, accessible and genuinely user-friendly audio-visual estate delivered across the meeting rooms, event spaces and communal areas of Castleforbes House — with the works carried out in a live, occupied office and with the same intuitive experience in every room, from a 6-person meeting room to the 150-person event space. Our approach rests on five operating principles:</w:t>
+      </w:r>
+    </w:p>
+    <w:p>
+      <w:pPr>
+        <w:pStyle w:val="ListBullet"/>
+      </w:pPr>
+      <w:r>
+        <w:t>Standardisation across all rooms. A single hardware platform family and one common, intuitive user interface across every room type, so SOLAS staff have an identical experience — and need no retraining — when they move between spaces or floors.</w:t>
+      </w:r>
+    </w:p>
+    <w:p>
+      <w:pPr>
+        <w:pStyle w:val="ListBullet"/>
+      </w:pPr>
+      <w:r>
+        <w:t>Integration with the existing SOLAS environment. The solution is designed to work natively with Microsoft 365 and Microsoft Teams, and to integrate room availability with the Clearooms booking platform so staff can see and book rooms without needing their laptops.</w:t>
+      </w:r>
+    </w:p>
+    <w:p>
+      <w:pPr>
+        <w:pStyle w:val="ListBullet"/>
+      </w:pPr>
+      <w:r>
+        <w:t>Accessibility by design. Accessibility for all participants is built into the design from the outset — not retro-fitted — and verified at commissioning.</w:t>
+      </w:r>
+    </w:p>
+    <w:p>
+      <w:pPr>
+        <w:pStyle w:val="ListBullet"/>
+      </w:pPr>
+      <w:r>
+        <w:t>Minimal disruption. The bulk of build and configuration is completed off-site through pre-staging, so on-site time in the live SOLAS building is minimised; installation is phased floor-by-floor and scheduled around SOLAS occupancy and events.</w:t>
+      </w:r>
+    </w:p>
+    <w:p>
+      <w:pPr>
+        <w:pStyle w:val="ListBullet"/>
+      </w:pPr>
+      <w:r>
+        <w:t>Single accountable relationship. One named Account Manager (Michael Koulis) with authority to make decisions, supported by a defined escalation path up to and including the COO, and a quality-managed (ISO 9001:2015) delivery organisation with 20+ years of Irish public-sector AV delivery.</w:t>
       </w:r>
     </w:p>
     <w:p>
@@ -148,7 +187,7 @@
     </w:p>
     <w:p>
       <w:r>
-        <w:t>We will deliver this project using a structured, stage-gated methodology. Each stage concludes with a formal sign-off with the SOLAS Evaluation / project team before the next stage begins, ensuring control, transparency and quality at every step:</w:t>
+        <w:t>We deliver using a structured, stage-gated methodology proven on comparable public-sector estates (Courts Service of Ireland, Department of Foreign Affairs, Tailte Éireann and Trinity College Dublin). Each stage closes with a formal sign-off with the SOLAS project team before the next begins:</w:t>
       </w:r>
     </w:p>
     <w:tbl>
@@ -175,7 +214,7 @@
               <w:rPr>
                 <w:b/>
                 <w:color w:val="FFFFFF"/>
-                <w:sz w:val="21"/>
+                <w:sz w:val="20"/>
               </w:rPr>
               <w:t>Stage</w:t>
             </w:r>
@@ -192,9 +231,9 @@
               <w:rPr>
                 <w:b/>
                 <w:color w:val="FFFFFF"/>
-                <w:sz w:val="21"/>
+                <w:sz w:val="20"/>
               </w:rPr>
-              <w:t>Activities</w:t>
+              <w:t>What we do</w:t>
             </w:r>
           </w:p>
         </w:tc>
@@ -209,7 +248,7 @@
               <w:rPr>
                 <w:b/>
                 <w:color w:val="FFFFFF"/>
-                <w:sz w:val="21"/>
+                <w:sz w:val="20"/>
               </w:rPr>
               <w:t>Outcome</w:t>
             </w:r>
@@ -226,9 +265,9 @@
             <w:r>
               <w:rPr>
                 <w:b w:val="0"/>
-                <w:sz w:val="21"/>
+                <w:sz w:val="20"/>
               </w:rPr>
-              <w:t>1. Discovery &amp; Detailed Design</w:t>
+              <w:t>1. Detailed Design &amp; Survey</w:t>
             </w:r>
           </w:p>
         </w:tc>
@@ -241,9 +280,9 @@
             <w:r>
               <w:rPr>
                 <w:b w:val="0"/>
-                <w:sz w:val="21"/>
+                <w:sz w:val="20"/>
               </w:rPr>
-              <w:t>Site survey building on the 18 May site visit; confirm room types, sizes and constraints; validate integration points with Microsoft 365/Teams and Clearooms; agree the standard room ‘templates’.</w:t>
+              <w:t>Building on the 18 May site visit, we conduct a room-by-room survey of all in-scope spaces on floors 2–5 (and the new reception, 3rd-floor canteen and offices); confirm the standard room ‘templates’; validate integration with Microsoft 365 / Teams and Clearooms; produce schematics and a room schedule.</w:t>
             </w:r>
           </w:p>
         </w:tc>
@@ -256,9 +295,9 @@
             <w:r>
               <w:rPr>
                 <w:b w:val="0"/>
-                <w:sz w:val="21"/>
+                <w:sz w:val="20"/>
               </w:rPr>
-              <w:t>Approved detailed design and room schedule.</w:t>
+              <w:t>Approved detailed design, room schedule and technical documentation.</w:t>
             </w:r>
           </w:p>
         </w:tc>
@@ -273,9 +312,9 @@
             <w:r>
               <w:rPr>
                 <w:b w:val="0"/>
-                <w:sz w:val="21"/>
+                <w:sz w:val="20"/>
               </w:rPr>
-              <w:t>2. Procurement &amp; Staging</w:t>
+              <w:t>2. Pre-Staging (off-site)</w:t>
             </w:r>
           </w:p>
         </w:tc>
@@ -288,9 +327,9 @@
             <w:r>
               <w:rPr>
                 <w:b w:val="0"/>
-                <w:sz w:val="21"/>
+                <w:sz w:val="20"/>
               </w:rPr>
-              <w:t>Order equipment; pre-configure and stage hardware off-site; quality check and asset-tag; prepare standardised build images.</w:t>
+              <w:t>AV racks built, cabled and labelled off-site; control processors and touch panels pre-programmed with the SOLAS standard UI; every system bench-tested before delivery.</w:t>
             </w:r>
           </w:p>
         </w:tc>
@@ -303,9 +342,9 @@
             <w:r>
               <w:rPr>
                 <w:b w:val="0"/>
-                <w:sz w:val="21"/>
+                <w:sz w:val="20"/>
               </w:rPr>
-              <w:t>Equipment staged and pre-tested.</w:t>
+              <w:t>Pre-staged, pre-tested equipment — minimal time in the live building.</w:t>
             </w:r>
           </w:p>
         </w:tc>
@@ -320,9 +359,9 @@
             <w:r>
               <w:rPr>
                 <w:b w:val="0"/>
-                <w:sz w:val="21"/>
+                <w:sz w:val="20"/>
               </w:rPr>
-              <w:t>3. Installation &amp; Integration</w:t>
+              <w:t>3. Hardware Integration (on-site)</w:t>
             </w:r>
           </w:p>
         </w:tc>
@@ -335,9 +374,9 @@
             <w:r>
               <w:rPr>
                 <w:b w:val="0"/>
-                <w:sz w:val="21"/>
+                <w:sz w:val="20"/>
               </w:rPr>
-              <w:t>Phased, floor-by-floor installation scheduled around SOLAS occupancy; cabling, mounting, integration with the network and Teams; room booking panel integration with Clearooms.</w:t>
+              <w:t>Phased, floor-by-floor installation around SOLAS occupancy; mounting, cabling and rack integration; room booking panels integrated with Clearooms.</w:t>
             </w:r>
           </w:p>
         </w:tc>
@@ -350,9 +389,9 @@
             <w:r>
               <w:rPr>
                 <w:b w:val="0"/>
-                <w:sz w:val="21"/>
+                <w:sz w:val="20"/>
               </w:rPr>
-              <w:t>Rooms installed and integrated.</w:t>
+              <w:t>Rooms physically installed and integrated.</w:t>
             </w:r>
           </w:p>
         </w:tc>
@@ -367,9 +406,9 @@
             <w:r>
               <w:rPr>
                 <w:b w:val="0"/>
-                <w:sz w:val="21"/>
+                <w:sz w:val="20"/>
               </w:rPr>
-              <w:t>4. Testing &amp; Commissioning</w:t>
+              <w:t>4. Programming &amp; Configuration</w:t>
             </w:r>
           </w:p>
         </w:tc>
@@ -382,9 +421,9 @@
             <w:r>
               <w:rPr>
                 <w:b w:val="0"/>
-                <w:sz w:val="21"/>
+                <w:sz w:val="20"/>
               </w:rPr>
-              <w:t>Functional and acceptance testing of every room against the agreed standard; accessibility checks; Teams call quality verification.</w:t>
+              <w:t>Source-to-display routing, audio DSP / AEC tuning, Teams integration, camera presets and room macros finalised; SOLAS standard UI confirmed on every panel.</w:t>
             </w:r>
           </w:p>
         </w:tc>
@@ -397,9 +436,9 @@
             <w:r>
               <w:rPr>
                 <w:b w:val="0"/>
-                <w:sz w:val="21"/>
+                <w:sz w:val="20"/>
               </w:rPr>
-              <w:t>Signed-off commissioning certificates.</w:t>
+              <w:t>Standardised, fully configured rooms.</w:t>
             </w:r>
           </w:p>
         </w:tc>
@@ -414,9 +453,9 @@
             <w:r>
               <w:rPr>
                 <w:b w:val="0"/>
-                <w:sz w:val="21"/>
+                <w:sz w:val="20"/>
               </w:rPr>
-              <w:t>5. Training &amp; Handover</w:t>
+              <w:t>5. Testing &amp; Commissioning</w:t>
             </w:r>
           </w:p>
         </w:tc>
@@ -429,9 +468,9 @@
             <w:r>
               <w:rPr>
                 <w:b w:val="0"/>
-                <w:sz w:val="21"/>
+                <w:sz w:val="20"/>
               </w:rPr>
-              <w:t>End-user ‘floor-walking’ and key-user training; admin/IT handover; as-built documentation and user guides.</w:t>
+              <w:t>End-to-end testing of every room against the agreed standard, including live Microsoft Teams calls, wireless presentation and accessibility checks.</w:t>
             </w:r>
           </w:p>
         </w:tc>
@@ -444,9 +483,9 @@
             <w:r>
               <w:rPr>
                 <w:b w:val="0"/>
-                <w:sz w:val="21"/>
+                <w:sz w:val="20"/>
               </w:rPr>
-              <w:t>Trained users and complete documentation.</w:t>
+              <w:t>Acceptance-tested rooms; SOLAS written technical sign-off.</w:t>
             </w:r>
           </w:p>
         </w:tc>
@@ -461,9 +500,9 @@
             <w:r>
               <w:rPr>
                 <w:b w:val="0"/>
-                <w:sz w:val="21"/>
+                <w:sz w:val="20"/>
               </w:rPr>
-              <w:t>6. Support &amp; Aftercare</w:t>
+              <w:t>6. Training &amp; Handover</w:t>
             </w:r>
           </w:p>
         </w:tc>
@@ -476,9 +515,9 @@
             <w:r>
               <w:rPr>
                 <w:b w:val="0"/>
-                <w:sz w:val="21"/>
+                <w:sz w:val="20"/>
               </w:rPr>
-              <w:t>Transition into the support and maintenance regime (see Section 3).</w:t>
+              <w:t>End-user and administrator training; as-built documentation and SOLAS-format user guides issued.</w:t>
             </w:r>
           </w:p>
         </w:tc>
@@ -491,9 +530,56 @@
             <w:r>
               <w:rPr>
                 <w:b w:val="0"/>
-                <w:sz w:val="21"/>
+                <w:sz w:val="20"/>
               </w:rPr>
-              <w:t>Operational service with agreed SLAs.</w:t>
+              <w:t>Trained users; complete handover pack.</w:t>
+            </w:r>
+          </w:p>
+        </w:tc>
+      </w:tr>
+      <w:tr>
+        <w:tc>
+          <w:tcPr>
+            <w:tcW w:type="dxa" w:w="2448"/>
+          </w:tcPr>
+          <w:p>
+            <w:r/>
+            <w:r>
+              <w:rPr>
+                <w:b w:val="0"/>
+                <w:sz w:val="20"/>
+              </w:rPr>
+              <w:t>7. Support &amp; Aftercare</w:t>
+            </w:r>
+          </w:p>
+        </w:tc>
+        <w:tc>
+          <w:tcPr>
+            <w:tcW w:type="dxa" w:w="5040"/>
+          </w:tcPr>
+          <w:p>
+            <w:r/>
+            <w:r>
+              <w:rPr>
+                <w:b w:val="0"/>
+                <w:sz w:val="20"/>
+              </w:rPr>
+              <w:t>Transition into the support, maintenance and SLA regime set out in Section 3.</w:t>
+            </w:r>
+          </w:p>
+        </w:tc>
+        <w:tc>
+          <w:tcPr>
+            <w:tcW w:type="dxa" w:w="1872"/>
+          </w:tcPr>
+          <w:p>
+            <w:r/>
+            <w:r>
+              <w:rPr>
+                <w:b w:val="0"/>
+                <w:sz w:val="20"/>
+              </w:rPr>
+              <w:t>Operational service under agreed SLAs.</w:t>
             </w:r>
           </w:p>
         </w:tc>
@@ -501,7 +587,7 @@
     </w:tbl>
     <w:p>
       <w:r>
-        <w:t>Standardisation is central to our approach: by deploying a consistent hardware platform and a single, intuitive user interface across every room type, we reduce the learning curve for SOLAS staff, simplify support and maintenance, and ensure a predictable experience whether a user is in a 6-person meeting room or the 150-person event space.</w:t>
+        <w:t>Standardisation is the thread running through every stage: a consistent platform and a single user interface reduce the learning curve for SOLAS staff, simplify long-term support and maintenance, and guarantee a predictable experience across the whole estate. The off-site pre-staging approach is deliberately chosen to protect SOLAS’s day-to-day operations — the room is only out of use for the minimum on-site installation window.</w:t>
       </w:r>
     </w:p>
     <w:p>
@@ -514,7 +600,7 @@
     </w:p>
     <w:p>
       <w:r>
-        <w:t>The indicative programme below assumes contract award following the tender process set out in the Descriptive Document. Durations are working weeks from contract award and will be confirmed and baselined at project initiation.</w:t>
+        <w:t>The indicative programme below is measured in working weeks from contract award and will be baselined and confirmed with the SOLAS point of contact at project initiation. Phasing is floor-by-floor to keep the maximum number of rooms in service at any time.</w:t>
       </w:r>
     </w:p>
     <w:tbl>
@@ -541,7 +627,7 @@
               <w:rPr>
                 <w:b/>
                 <w:color w:val="FFFFFF"/>
-                <w:sz w:val="21"/>
+                <w:sz w:val="20"/>
               </w:rPr>
               <w:t>Stage</w:t>
             </w:r>
@@ -558,7 +644,7 @@
               <w:rPr>
                 <w:b/>
                 <w:color w:val="FFFFFF"/>
-                <w:sz w:val="21"/>
+                <w:sz w:val="20"/>
               </w:rPr>
               <w:t>Indicative Duration</w:t>
             </w:r>
@@ -575,7 +661,7 @@
               <w:rPr>
                 <w:b/>
                 <w:color w:val="FFFFFF"/>
-                <w:sz w:val="21"/>
+                <w:sz w:val="20"/>
               </w:rPr>
               <w:t>Notes</w:t>
             </w:r>
@@ -592,9 +678,9 @@
             <w:r>
               <w:rPr>
                 <w:b w:val="0"/>
-                <w:sz w:val="21"/>
+                <w:sz w:val="20"/>
               </w:rPr>
-              <w:t>Project initiation &amp; mobilisation</w:t>
+              <w:t>Initiation &amp; mobilisation</w:t>
             </w:r>
           </w:p>
         </w:tc>
@@ -607,7 +693,7 @@
             <w:r>
               <w:rPr>
                 <w:b w:val="0"/>
-                <w:sz w:val="21"/>
+                <w:sz w:val="20"/>
               </w:rPr>
               <w:t>Week 1</w:t>
             </w:r>
@@ -622,9 +708,9 @@
             <w:r>
               <w:rPr>
                 <w:b w:val="0"/>
-                <w:sz w:val="21"/>
+                <w:sz w:val="20"/>
               </w:rPr>
-              <w:t>Kick-off, governance set-up, baseline plan.</w:t>
+              <w:t>Kick-off, governance set-up, comms protocol, baseline plan.</w:t>
             </w:r>
           </w:p>
         </w:tc>
@@ -639,9 +725,9 @@
             <w:r>
               <w:rPr>
                 <w:b w:val="0"/>
-                <w:sz w:val="21"/>
+                <w:sz w:val="20"/>
               </w:rPr>
-              <w:t>Discovery &amp; detailed design</w:t>
+              <w:t>Detailed design &amp; survey</w:t>
             </w:r>
           </w:p>
         </w:tc>
@@ -654,7 +740,7 @@
             <w:r>
               <w:rPr>
                 <w:b w:val="0"/>
-                <w:sz w:val="21"/>
+                <w:sz w:val="20"/>
               </w:rPr>
               <w:t>Weeks 1–3</w:t>
             </w:r>
@@ -669,9 +755,9 @@
             <w:r>
               <w:rPr>
                 <w:b w:val="0"/>
-                <w:sz w:val="21"/>
+                <w:sz w:val="20"/>
               </w:rPr>
-              <w:t>Final survey and design sign-off.</w:t>
+              <w:t>Room-by-room sign-off.</w:t>
             </w:r>
           </w:p>
         </w:tc>
@@ -686,9 +772,9 @@
             <w:r>
               <w:rPr>
                 <w:b w:val="0"/>
-                <w:sz w:val="21"/>
+                <w:sz w:val="20"/>
               </w:rPr>
-              <w:t>Procurement &amp; staging</w:t>
+              <w:t>Procurement &amp; pre-staging (off-site)</w:t>
             </w:r>
           </w:p>
         </w:tc>
@@ -701,7 +787,7 @@
             <w:r>
               <w:rPr>
                 <w:b w:val="0"/>
-                <w:sz w:val="21"/>
+                <w:sz w:val="20"/>
               </w:rPr>
               <w:t>Weeks 3–7</w:t>
             </w:r>
@@ -716,9 +802,9 @@
             <w:r>
               <w:rPr>
                 <w:b w:val="0"/>
-                <w:sz w:val="21"/>
+                <w:sz w:val="20"/>
               </w:rPr>
-              <w:t>Subject to equipment lead times.</w:t>
+              <w:t>Subject to equipment lead times; racks bench-tested.</w:t>
             </w:r>
           </w:p>
         </w:tc>
@@ -733,7 +819,7 @@
             <w:r>
               <w:rPr>
                 <w:b w:val="0"/>
-                <w:sz w:val="21"/>
+                <w:sz w:val="20"/>
               </w:rPr>
               <w:t>Installation &amp; integration (phased)</w:t>
             </w:r>
@@ -748,7 +834,7 @@
             <w:r>
               <w:rPr>
                 <w:b w:val="0"/>
-                <w:sz w:val="21"/>
+                <w:sz w:val="20"/>
               </w:rPr>
               <w:t>Weeks 6–12</w:t>
             </w:r>
@@ -763,9 +849,9 @@
             <w:r>
               <w:rPr>
                 <w:b w:val="0"/>
-                <w:sz w:val="21"/>
+                <w:sz w:val="20"/>
               </w:rPr>
-              <w:t>Floor-by-floor, around occupancy.</w:t>
+              <w:t>Floor-by-floor, around SOLAS occupancy and events.</w:t>
             </w:r>
           </w:p>
         </w:tc>
@@ -780,9 +866,9 @@
             <w:r>
               <w:rPr>
                 <w:b w:val="0"/>
-                <w:sz w:val="21"/>
+                <w:sz w:val="20"/>
               </w:rPr>
-              <w:t>Testing &amp; commissioning</w:t>
+              <w:t>Programming, testing &amp; commissioning</w:t>
             </w:r>
           </w:p>
         </w:tc>
@@ -795,9 +881,9 @@
             <w:r>
               <w:rPr>
                 <w:b w:val="0"/>
-                <w:sz w:val="21"/>
+                <w:sz w:val="20"/>
               </w:rPr>
-              <w:t>Weeks 10–13</w:t>
+              <w:t>Weeks 9–13</w:t>
             </w:r>
           </w:p>
         </w:tc>
@@ -810,9 +896,9 @@
             <w:r>
               <w:rPr>
                 <w:b w:val="0"/>
-                <w:sz w:val="21"/>
+                <w:sz w:val="20"/>
               </w:rPr>
-              <w:t>Room-by-room acceptance.</w:t>
+              <w:t>Room-by-room acceptance and Teams call quality.</w:t>
             </w:r>
           </w:p>
         </w:tc>
@@ -827,7 +913,7 @@
             <w:r>
               <w:rPr>
                 <w:b w:val="0"/>
-                <w:sz w:val="21"/>
+                <w:sz w:val="20"/>
               </w:rPr>
               <w:t>Training &amp; handover</w:t>
             </w:r>
@@ -842,7 +928,7 @@
             <w:r>
               <w:rPr>
                 <w:b w:val="0"/>
-                <w:sz w:val="21"/>
+                <w:sz w:val="20"/>
               </w:rPr>
               <w:t>Weeks 12–14</w:t>
             </w:r>
@@ -857,9 +943,9 @@
             <w:r>
               <w:rPr>
                 <w:b w:val="0"/>
-                <w:sz w:val="21"/>
+                <w:sz w:val="20"/>
               </w:rPr>
-              <w:t>User and admin training.</w:t>
+              <w:t>Users and administrators.</w:t>
             </w:r>
           </w:p>
         </w:tc>
@@ -874,9 +960,9 @@
             <w:r>
               <w:rPr>
                 <w:b w:val="0"/>
-                <w:sz w:val="21"/>
+                <w:sz w:val="20"/>
               </w:rPr>
-              <w:t>Go-live &amp; early-life support</w:t>
+              <w:t>Go-live &amp; early-life (hypercare) support</w:t>
             </w:r>
           </w:p>
         </w:tc>
@@ -889,7 +975,7 @@
             <w:r>
               <w:rPr>
                 <w:b w:val="0"/>
-                <w:sz w:val="21"/>
+                <w:sz w:val="20"/>
               </w:rPr>
               <w:t>Week 14 onward</w:t>
             </w:r>
@@ -904,9 +990,9 @@
             <w:r>
               <w:rPr>
                 <w:b w:val="0"/>
-                <w:sz w:val="21"/>
+                <w:sz w:val="20"/>
               </w:rPr>
-              <w:t>Hypercare period.</w:t>
+              <w:t>Heightened support, then steady-state SLA service.</w:t>
             </w:r>
           </w:p>
         </w:tc>
@@ -918,7 +1004,7 @@
           <w:i/>
           <w:color w:val="C00000"/>
         </w:rPr>
-        <w:t>[Confirm/adjust durations to match your standard delivery programme and known equipment lead times. Insert a Gantt chart here if your TCD response included one.]</w:t>
+        <w:t>[A detailed Gantt chart can be inserted here, as per the Stacked mobilisation plan format used on the DETE / Courts Service programmes.]</w:t>
       </w:r>
     </w:p>
     <w:p>
@@ -931,7 +1017,7 @@
     </w:p>
     <w:p>
       <w:r>
-        <w:t>The project will be governed by a detailed project plan owned by our appointed Project Manager and maintained throughout delivery. The plan covers:</w:t>
+        <w:t>The project is governed by a detailed plan owned by our Lead Project Manager (Niamh O’Farrell) under the Head of Projects (Gillian McCann), and maintained throughout delivery. Every contract obligation maps to a named individual, and each named role has a deputy so a single absence never leaves a task unowned. The plan covers:</w:t>
       </w:r>
     </w:p>
     <w:p>
@@ -947,7 +1033,7 @@
         <w:pStyle w:val="ListBullet"/>
       </w:pPr>
       <w:r>
-        <w:t>Clear governance with defined roles and a RACI matrix for SOLAS and [Company Name] (see Section 3).</w:t>
+        <w:t>A three-tier governance structure (below) with a clear RACI for SOLAS and Stacked Ltd.</w:t>
       </w:r>
     </w:p>
     <w:p>
@@ -955,7 +1041,7 @@
         <w:pStyle w:val="ListBullet"/>
       </w:pPr>
       <w:r>
-        <w:t>A communications and reporting plan, including regular progress meetings and written status reports to the SOLAS project lead.</w:t>
+        <w:t>A communications and reporting plan — a written progress report and a short operational call at an agreed cadence with the SOLAS point of contact.</w:t>
       </w:r>
     </w:p>
     <w:p>
@@ -963,7 +1049,7 @@
         <w:pStyle w:val="ListBullet"/>
       </w:pPr>
       <w:r>
-        <w:t>Phasing designed around SOLAS occupancy of floors 2–5 (and any subsequent ground/1st floor scope) to minimise disruption to live meetings and events.</w:t>
+        <w:t>Phasing designed around SOLAS occupancy of floors 2–5 (and any subsequent ground / 1st-floor scope) to minimise disruption to live meetings and events.</w:t>
       </w:r>
     </w:p>
     <w:p>
@@ -971,7 +1057,7 @@
         <w:pStyle w:val="ListBullet"/>
       </w:pPr>
       <w:r>
-        <w:t>Change control, issue management and a maintained risk register (see 1.4).</w:t>
+        <w:t>Documented change control, issue management and a live risk register (1.4).</w:t>
       </w:r>
     </w:p>
     <w:p>
@@ -979,7 +1065,465 @@
         <w:pStyle w:val="ListBullet"/>
       </w:pPr>
       <w:r>
-        <w:t>Quality management, including room-by-room acceptance testing and formal sign-off gates.</w:t>
+        <w:t>Quality management under our ISO 9001:2015 QMS, with room-by-room acceptance testing and formal sign-off gates.</w:t>
+      </w:r>
+    </w:p>
+    <w:p>
+      <w:pPr>
+        <w:pStyle w:val="Heading3"/>
+      </w:pPr>
+      <w:r>
+        <w:t>Governance &amp; key roles</w:t>
+      </w:r>
+    </w:p>
+    <w:tbl>
+      <w:tblPr>
+        <w:tblStyle w:val="TableGrid"/>
+        <w:tblW w:type="auto" w:w="0"/>
+        <w:jc w:val="center"/>
+        <w:tblLook w:firstColumn="1" w:firstRow="1" w:lastColumn="0" w:lastRow="0" w:noHBand="0" w:noVBand="1" w:val="04A0"/>
+      </w:tblPr>
+      <w:tblGrid>
+        <w:gridCol w:w="2880"/>
+        <w:gridCol w:w="2880"/>
+        <w:gridCol w:w="2880"/>
+      </w:tblGrid>
+      <w:tr>
+        <w:tc>
+          <w:tcPr>
+            <w:tcW w:type="dxa" w:w="2736"/>
+            <w:shd w:val="clear" w:fill="1F3364"/>
+          </w:tcPr>
+          <w:p>
+            <w:r/>
+            <w:r>
+              <w:rPr>
+                <w:b/>
+                <w:color w:val="FFFFFF"/>
+                <w:sz w:val="20"/>
+              </w:rPr>
+              <w:t>Stacked Ltd Role</w:t>
+            </w:r>
+          </w:p>
+        </w:tc>
+        <w:tc>
+          <w:tcPr>
+            <w:tcW w:type="dxa" w:w="2160"/>
+            <w:shd w:val="clear" w:fill="1F3364"/>
+          </w:tcPr>
+          <w:p>
+            <w:r/>
+            <w:r>
+              <w:rPr>
+                <w:b/>
+                <w:color w:val="FFFFFF"/>
+                <w:sz w:val="20"/>
+              </w:rPr>
+              <w:t>Holder</w:t>
+            </w:r>
+          </w:p>
+        </w:tc>
+        <w:tc>
+          <w:tcPr>
+            <w:tcW w:type="dxa" w:w="4464"/>
+            <w:shd w:val="clear" w:fill="1F3364"/>
+          </w:tcPr>
+          <w:p>
+            <w:r/>
+            <w:r>
+              <w:rPr>
+                <w:b/>
+                <w:color w:val="FFFFFF"/>
+                <w:sz w:val="20"/>
+              </w:rPr>
+              <w:t>Responsibility on this project</w:t>
+            </w:r>
+          </w:p>
+        </w:tc>
+      </w:tr>
+      <w:tr>
+        <w:tc>
+          <w:tcPr>
+            <w:tcW w:type="dxa" w:w="2736"/>
+          </w:tcPr>
+          <w:p>
+            <w:r/>
+            <w:r>
+              <w:rPr>
+                <w:b w:val="0"/>
+                <w:sz w:val="20"/>
+              </w:rPr>
+              <w:t>Executive Sponsor</w:t>
+            </w:r>
+          </w:p>
+        </w:tc>
+        <w:tc>
+          <w:tcPr>
+            <w:tcW w:type="dxa" w:w="2160"/>
+          </w:tcPr>
+          <w:p>
+            <w:r/>
+            <w:r>
+              <w:rPr>
+                <w:b w:val="0"/>
+                <w:sz w:val="20"/>
+              </w:rPr>
+              <w:t>Gavin Byrne (COO)</w:t>
+            </w:r>
+          </w:p>
+        </w:tc>
+        <w:tc>
+          <w:tcPr>
+            <w:tcW w:type="dxa" w:w="4464"/>
+          </w:tcPr>
+          <w:p>
+            <w:r/>
+            <w:r>
+              <w:rPr>
+                <w:b w:val="0"/>
+                <w:sz w:val="20"/>
+              </w:rPr>
+              <w:t>Signs the contract on award; final (Tier-4) escalation and commercial authority.</w:t>
+            </w:r>
+          </w:p>
+        </w:tc>
+      </w:tr>
+      <w:tr>
+        <w:tc>
+          <w:tcPr>
+            <w:tcW w:type="dxa" w:w="2736"/>
+          </w:tcPr>
+          <w:p>
+            <w:r/>
+            <w:r>
+              <w:rPr>
+                <w:b w:val="0"/>
+                <w:sz w:val="20"/>
+              </w:rPr>
+              <w:t>Account / Contract Manager</w:t>
+            </w:r>
+          </w:p>
+        </w:tc>
+        <w:tc>
+          <w:tcPr>
+            <w:tcW w:type="dxa" w:w="2160"/>
+          </w:tcPr>
+          <w:p>
+            <w:r/>
+            <w:r>
+              <w:rPr>
+                <w:b w:val="0"/>
+                <w:sz w:val="20"/>
+              </w:rPr>
+              <w:t>Michael Koulis</w:t>
+            </w:r>
+          </w:p>
+        </w:tc>
+        <w:tc>
+          <w:tcPr>
+            <w:tcW w:type="dxa" w:w="4464"/>
+          </w:tcPr>
+          <w:p>
+            <w:r/>
+            <w:r>
+              <w:rPr>
+                <w:b w:val="0"/>
+                <w:sz w:val="20"/>
+              </w:rPr>
+              <w:t>Single point of contact; commercial and operational decisions; chairs progress and review meetings.</w:t>
+            </w:r>
+          </w:p>
+        </w:tc>
+      </w:tr>
+      <w:tr>
+        <w:tc>
+          <w:tcPr>
+            <w:tcW w:type="dxa" w:w="2736"/>
+          </w:tcPr>
+          <w:p>
+            <w:r/>
+            <w:r>
+              <w:rPr>
+                <w:b w:val="0"/>
+                <w:sz w:val="20"/>
+              </w:rPr>
+              <w:t>Head of Projects</w:t>
+            </w:r>
+          </w:p>
+        </w:tc>
+        <w:tc>
+          <w:tcPr>
+            <w:tcW w:type="dxa" w:w="2160"/>
+          </w:tcPr>
+          <w:p>
+            <w:r/>
+            <w:r>
+              <w:rPr>
+                <w:b w:val="0"/>
+                <w:sz w:val="20"/>
+              </w:rPr>
+              <w:t>Gillian McCann</w:t>
+            </w:r>
+          </w:p>
+        </w:tc>
+        <w:tc>
+          <w:tcPr>
+            <w:tcW w:type="dxa" w:w="4464"/>
+          </w:tcPr>
+          <w:p>
+            <w:r/>
+            <w:r>
+              <w:rPr>
+                <w:b w:val="0"/>
+                <w:sz w:val="20"/>
+              </w:rPr>
+              <w:t>Project governance, installation scheduling, logistics, operational interface with SOLAS.</w:t>
+            </w:r>
+          </w:p>
+        </w:tc>
+      </w:tr>
+      <w:tr>
+        <w:tc>
+          <w:tcPr>
+            <w:tcW w:type="dxa" w:w="2736"/>
+          </w:tcPr>
+          <w:p>
+            <w:r/>
+            <w:r>
+              <w:rPr>
+                <w:b w:val="0"/>
+                <w:sz w:val="20"/>
+              </w:rPr>
+              <w:t>Lead Project Manager</w:t>
+            </w:r>
+          </w:p>
+        </w:tc>
+        <w:tc>
+          <w:tcPr>
+            <w:tcW w:type="dxa" w:w="2160"/>
+          </w:tcPr>
+          <w:p>
+            <w:r/>
+            <w:r>
+              <w:rPr>
+                <w:b w:val="0"/>
+                <w:sz w:val="20"/>
+              </w:rPr>
+              <w:t>Niamh O’Farrell</w:t>
+            </w:r>
+          </w:p>
+        </w:tc>
+        <w:tc>
+          <w:tcPr>
+            <w:tcW w:type="dxa" w:w="4464"/>
+          </w:tcPr>
+          <w:p>
+            <w:r/>
+            <w:r>
+              <w:rPr>
+                <w:b w:val="0"/>
+                <w:sz w:val="20"/>
+              </w:rPr>
+              <w:t>Day-to-day delivery manager; daily liaison with the SOLAS facilities contact; owns the schedule and progress report.</w:t>
+            </w:r>
+          </w:p>
+        </w:tc>
+      </w:tr>
+      <w:tr>
+        <w:tc>
+          <w:tcPr>
+            <w:tcW w:type="dxa" w:w="2736"/>
+          </w:tcPr>
+          <w:p>
+            <w:r/>
+            <w:r>
+              <w:rPr>
+                <w:b w:val="0"/>
+                <w:sz w:val="20"/>
+              </w:rPr>
+              <w:t>Head of AV Design</w:t>
+            </w:r>
+          </w:p>
+        </w:tc>
+        <w:tc>
+          <w:tcPr>
+            <w:tcW w:type="dxa" w:w="2160"/>
+          </w:tcPr>
+          <w:p>
+            <w:r/>
+            <w:r>
+              <w:rPr>
+                <w:b w:val="0"/>
+                <w:sz w:val="20"/>
+              </w:rPr>
+              <w:t>Conor Friel</w:t>
+            </w:r>
+          </w:p>
+        </w:tc>
+        <w:tc>
+          <w:tcPr>
+            <w:tcW w:type="dxa" w:w="4464"/>
+          </w:tcPr>
+          <w:p>
+            <w:r/>
+            <w:r>
+              <w:rPr>
+                <w:b w:val="0"/>
+                <w:sz w:val="20"/>
+              </w:rPr>
+              <w:t>Detailed design, standardisation, control-system templates, commissioning sign-off.</w:t>
+            </w:r>
+          </w:p>
+        </w:tc>
+      </w:tr>
+      <w:tr>
+        <w:tc>
+          <w:tcPr>
+            <w:tcW w:type="dxa" w:w="2736"/>
+          </w:tcPr>
+          <w:p>
+            <w:r/>
+            <w:r>
+              <w:rPr>
+                <w:b w:val="0"/>
+                <w:sz w:val="20"/>
+              </w:rPr>
+              <w:t>AV Solutions Architect</w:t>
+            </w:r>
+          </w:p>
+        </w:tc>
+        <w:tc>
+          <w:tcPr>
+            <w:tcW w:type="dxa" w:w="2160"/>
+          </w:tcPr>
+          <w:p>
+            <w:r/>
+            <w:r>
+              <w:rPr>
+                <w:b w:val="0"/>
+                <w:sz w:val="20"/>
+              </w:rPr>
+              <w:t>Jason McCourt</w:t>
+            </w:r>
+          </w:p>
+        </w:tc>
+        <w:tc>
+          <w:tcPr>
+            <w:tcW w:type="dxa" w:w="4464"/>
+          </w:tcPr>
+          <w:p>
+            <w:r/>
+            <w:r>
+              <w:rPr>
+                <w:b w:val="0"/>
+                <w:sz w:val="20"/>
+              </w:rPr>
+              <w:t>Room surveys and room-by-room specifications; Teams Rooms architecture.</w:t>
+            </w:r>
+          </w:p>
+        </w:tc>
+      </w:tr>
+      <w:tr>
+        <w:tc>
+          <w:tcPr>
+            <w:tcW w:type="dxa" w:w="2736"/>
+          </w:tcPr>
+          <w:p>
+            <w:r/>
+            <w:r>
+              <w:rPr>
+                <w:b w:val="0"/>
+                <w:sz w:val="20"/>
+              </w:rPr>
+              <w:t>Field Engineering Team Lead</w:t>
+            </w:r>
+          </w:p>
+        </w:tc>
+        <w:tc>
+          <w:tcPr>
+            <w:tcW w:type="dxa" w:w="2160"/>
+          </w:tcPr>
+          <w:p>
+            <w:r/>
+            <w:r>
+              <w:rPr>
+                <w:b w:val="0"/>
+                <w:sz w:val="20"/>
+              </w:rPr>
+              <w:t>Paul Rochester</w:t>
+            </w:r>
+          </w:p>
+        </w:tc>
+        <w:tc>
+          <w:tcPr>
+            <w:tcW w:type="dxa" w:w="4464"/>
+          </w:tcPr>
+          <w:p>
+            <w:r/>
+            <w:r>
+              <w:rPr>
+                <w:b w:val="0"/>
+                <w:sz w:val="20"/>
+              </w:rPr>
+              <w:t>On-site installation and commissioning; programming; Level-1 training to SOLAS IT.</w:t>
+            </w:r>
+          </w:p>
+        </w:tc>
+      </w:tr>
+      <w:tr>
+        <w:tc>
+          <w:tcPr>
+            <w:tcW w:type="dxa" w:w="2736"/>
+          </w:tcPr>
+          <w:p>
+            <w:r/>
+            <w:r>
+              <w:rPr>
+                <w:b w:val="0"/>
+                <w:sz w:val="20"/>
+              </w:rPr>
+              <w:t>Operations &amp; Quality Manager</w:t>
+            </w:r>
+          </w:p>
+        </w:tc>
+        <w:tc>
+          <w:tcPr>
+            <w:tcW w:type="dxa" w:w="2160"/>
+          </w:tcPr>
+          <w:p>
+            <w:r/>
+            <w:r>
+              <w:rPr>
+                <w:b w:val="0"/>
+                <w:sz w:val="20"/>
+              </w:rPr>
+              <w:t>Joanna Morgan</w:t>
+            </w:r>
+          </w:p>
+        </w:tc>
+        <w:tc>
+          <w:tcPr>
+            <w:tcW w:type="dxa" w:w="4464"/>
+          </w:tcPr>
+          <w:p>
+            <w:r/>
+            <w:r>
+              <w:rPr>
+                <w:b w:val="0"/>
+                <w:sz w:val="20"/>
+              </w:rPr>
+              <w:t>ISO 9001/14001, RAMS and Safety Statements, site-access compliance.</w:t>
+            </w:r>
+          </w:p>
+        </w:tc>
+      </w:tr>
+    </w:tbl>
+    <w:p>
+      <w:pPr>
+        <w:pStyle w:val="Heading3"/>
+      </w:pPr>
+      <w:r>
+        <w:t>Key milestones</w:t>
       </w:r>
     </w:p>
     <w:tbl>
@@ -1005,9 +1549,9 @@
               <w:rPr>
                 <w:b/>
                 <w:color w:val="FFFFFF"/>
-                <w:sz w:val="21"/>
+                <w:sz w:val="20"/>
               </w:rPr>
-              <w:t>Key Milestone</w:t>
+              <w:t>Milestone</w:t>
             </w:r>
           </w:p>
         </w:tc>
@@ -1022,9 +1566,9 @@
               <w:rPr>
                 <w:b/>
                 <w:color w:val="FFFFFF"/>
-                <w:sz w:val="21"/>
+                <w:sz w:val="20"/>
               </w:rPr>
-              <w:t>Acceptance Criteria</w:t>
+              <w:t>Acceptance criteria</w:t>
             </w:r>
           </w:p>
         </w:tc>
@@ -1039,7 +1583,7 @@
             <w:r>
               <w:rPr>
                 <w:b w:val="0"/>
-                <w:sz w:val="21"/>
+                <w:sz w:val="20"/>
               </w:rPr>
               <w:t>Design sign-off</w:t>
             </w:r>
@@ -1054,7 +1598,7 @@
             <w:r>
               <w:rPr>
                 <w:b w:val="0"/>
-                <w:sz w:val="21"/>
+                <w:sz w:val="20"/>
               </w:rPr>
               <w:t>SOLAS approval of detailed design and room schedule.</w:t>
             </w:r>
@@ -1071,9 +1615,9 @@
             <w:r>
               <w:rPr>
                 <w:b w:val="0"/>
-                <w:sz w:val="21"/>
+                <w:sz w:val="20"/>
               </w:rPr>
-              <w:t>First room/floor complete</w:t>
+              <w:t>Pilot room/floor complete</w:t>
             </w:r>
           </w:p>
         </w:tc>
@@ -1086,9 +1630,9 @@
             <w:r>
               <w:rPr>
                 <w:b w:val="0"/>
-                <w:sz w:val="21"/>
+                <w:sz w:val="20"/>
               </w:rPr>
-              <w:t>Successful acceptance test of pilot room/floor.</w:t>
+              <w:t>Successful acceptance test of first room/floor.</w:t>
             </w:r>
           </w:p>
         </w:tc>
@@ -1103,7 +1647,7 @@
             <w:r>
               <w:rPr>
                 <w:b w:val="0"/>
-                <w:sz w:val="21"/>
+                <w:sz w:val="20"/>
               </w:rPr>
               <w:t>All rooms installed</w:t>
             </w:r>
@@ -1118,7 +1662,7 @@
             <w:r>
               <w:rPr>
                 <w:b w:val="0"/>
-                <w:sz w:val="21"/>
+                <w:sz w:val="20"/>
               </w:rPr>
               <w:t>All in-scope rooms installed and integrated.</w:t>
             </w:r>
@@ -1135,7 +1679,7 @@
             <w:r>
               <w:rPr>
                 <w:b w:val="0"/>
-                <w:sz w:val="21"/>
+                <w:sz w:val="20"/>
               </w:rPr>
               <w:t>Commissioning complete</w:t>
             </w:r>
@@ -1150,9 +1694,9 @@
             <w:r>
               <w:rPr>
                 <w:b w:val="0"/>
-                <w:sz w:val="21"/>
+                <w:sz w:val="20"/>
               </w:rPr>
-              <w:t>All acceptance tests passed and signed off.</w:t>
+              <w:t>All acceptance tests passed; SOLAS written technical sign-off.</w:t>
             </w:r>
           </w:p>
         </w:tc>
@@ -1167,7 +1711,7 @@
             <w:r>
               <w:rPr>
                 <w:b w:val="0"/>
-                <w:sz w:val="21"/>
+                <w:sz w:val="20"/>
               </w:rPr>
               <w:t>Training complete</w:t>
             </w:r>
@@ -1182,7 +1726,7 @@
             <w:r>
               <w:rPr>
                 <w:b w:val="0"/>
-                <w:sz w:val="21"/>
+                <w:sz w:val="20"/>
               </w:rPr>
               <w:t>Users and administrators trained; guides issued.</w:t>
             </w:r>
@@ -1199,7 +1743,7 @@
             <w:r>
               <w:rPr>
                 <w:b w:val="0"/>
-                <w:sz w:val="21"/>
+                <w:sz w:val="20"/>
               </w:rPr>
               <w:t>Project handover</w:t>
             </w:r>
@@ -1214,9 +1758,9 @@
             <w:r>
               <w:rPr>
                 <w:b w:val="0"/>
-                <w:sz w:val="21"/>
+                <w:sz w:val="20"/>
               </w:rPr>
-              <w:t>As-built documentation issued; service commenced.</w:t>
+              <w:t>As-built documentation issued; support service commenced.</w:t>
             </w:r>
           </w:p>
         </w:tc>
@@ -1232,7 +1776,7 @@
     </w:p>
     <w:p>
       <w:r>
-        <w:t>Risks are identified at initiation and managed through a live risk register reviewed at every progress meeting. Our initial assessment of key risks and mitigations is set out below.</w:t>
+        <w:t>Stacked Ltd treats risk as an explicit, owned and reported part of project management. A risk register is opened at mobilisation, owned by the Account Manager, reviewed at every progress meeting, and reported to SOLAS. Every risk has an owner, a likelihood and impact rating, a mitigation and a review date. Our initial assessment of the key risks for this project is below.</w:t>
       </w:r>
     </w:p>
     <w:tbl>
@@ -1259,7 +1803,7 @@
               <w:rPr>
                 <w:b/>
                 <w:color w:val="FFFFFF"/>
-                <w:sz w:val="21"/>
+                <w:sz w:val="20"/>
               </w:rPr>
               <w:t>Risk</w:t>
             </w:r>
@@ -1276,7 +1820,7 @@
               <w:rPr>
                 <w:b/>
                 <w:color w:val="FFFFFF"/>
-                <w:sz w:val="21"/>
+                <w:sz w:val="20"/>
               </w:rPr>
               <w:t>Likelihood / Impact</w:t>
             </w:r>
@@ -1293,7 +1837,7 @@
               <w:rPr>
                 <w:b/>
                 <w:color w:val="FFFFFF"/>
-                <w:sz w:val="21"/>
+                <w:sz w:val="20"/>
               </w:rPr>
               <w:t>Mitigation</w:t>
             </w:r>
@@ -1310,7 +1854,7 @@
             <w:r>
               <w:rPr>
                 <w:b w:val="0"/>
-                <w:sz w:val="21"/>
+                <w:sz w:val="20"/>
               </w:rPr>
               <w:t>Disruption to live SOLAS operations during installation</w:t>
             </w:r>
@@ -1325,7 +1869,7 @@
             <w:r>
               <w:rPr>
                 <w:b w:val="0"/>
-                <w:sz w:val="21"/>
+                <w:sz w:val="20"/>
               </w:rPr>
               <w:t>Medium / High</w:t>
             </w:r>
@@ -1340,9 +1884,9 @@
             <w:r>
               <w:rPr>
                 <w:b w:val="0"/>
-                <w:sz w:val="21"/>
+                <w:sz w:val="20"/>
               </w:rPr>
-              <w:t>Phased, floor-by-floor works scheduled around occupancy and key events; out-of-hours working where required; clear advance notice to SOLAS.</w:t>
+              <w:t>Off-site pre-staging minimises on-site time; phased floor-by-floor works scheduled around occupancy and events; out-of-hours working where required; advance notice to SOLAS Facilities.</w:t>
             </w:r>
           </w:p>
         </w:tc>
@@ -1357,7 +1901,7 @@
             <w:r>
               <w:rPr>
                 <w:b w:val="0"/>
-                <w:sz w:val="21"/>
+                <w:sz w:val="20"/>
               </w:rPr>
               <w:t>Equipment lead times / supply delays</w:t>
             </w:r>
@@ -1372,7 +1916,7 @@
             <w:r>
               <w:rPr>
                 <w:b w:val="0"/>
-                <w:sz w:val="21"/>
+                <w:sz w:val="20"/>
               </w:rPr>
               <w:t>Medium / Medium</w:t>
             </w:r>
@@ -1387,9 +1931,9 @@
             <w:r>
               <w:rPr>
                 <w:b w:val="0"/>
-                <w:sz w:val="21"/>
+                <w:sz w:val="20"/>
               </w:rPr>
-              <w:t>Early procurement; pre-staging; alternative equivalent products identified; lead times tracked in the plan.</w:t>
+              <w:t>Early procurement; OEM partner accounts (Crestron, Cisco) for advance visibility; like-for-like alternatives pre-identified; lead times tracked in the plan.</w:t>
             </w:r>
           </w:p>
         </w:tc>
@@ -1404,9 +1948,9 @@
             <w:r>
               <w:rPr>
                 <w:b w:val="0"/>
-                <w:sz w:val="21"/>
+                <w:sz w:val="20"/>
               </w:rPr>
-              <w:t>Integration issues with M365/Teams and Clearooms</w:t>
+              <w:t>Integration with Microsoft 365 / Teams and Clearooms</w:t>
             </w:r>
           </w:p>
         </w:tc>
@@ -1419,7 +1963,7 @@
             <w:r>
               <w:rPr>
                 <w:b w:val="0"/>
-                <w:sz w:val="21"/>
+                <w:sz w:val="20"/>
               </w:rPr>
               <w:t>Low / High</w:t>
             </w:r>
@@ -1434,9 +1978,9 @@
             <w:r>
               <w:rPr>
                 <w:b w:val="0"/>
-                <w:sz w:val="21"/>
+                <w:sz w:val="20"/>
               </w:rPr>
-              <w:t>Early validation of integration points in design stage; controlled test environment; close coordination with SOLAS IT.</w:t>
+              <w:t>Integration points validated at design stage with SOLAS IT; controlled test environment; Teams call-quality verified at commissioning.</w:t>
             </w:r>
           </w:p>
         </w:tc>
@@ -1451,9 +1995,9 @@
             <w:r>
               <w:rPr>
                 <w:b w:val="0"/>
-                <w:sz w:val="21"/>
+                <w:sz w:val="20"/>
               </w:rPr>
-              <w:t>Inconsistent user experience across room types</w:t>
+              <w:t>Inconsistent experience across room types</w:t>
             </w:r>
           </w:p>
         </w:tc>
@@ -1466,7 +2010,7 @@
             <w:r>
               <w:rPr>
                 <w:b w:val="0"/>
-                <w:sz w:val="21"/>
+                <w:sz w:val="20"/>
               </w:rPr>
               <w:t>Low / Medium</w:t>
             </w:r>
@@ -1481,9 +2025,9 @@
             <w:r>
               <w:rPr>
                 <w:b w:val="0"/>
-                <w:sz w:val="21"/>
+                <w:sz w:val="20"/>
               </w:rPr>
-              <w:t>Standardised platform and single UI across all rooms; standardised build and acceptance test scripts.</w:t>
+              <w:t>Single standardised platform and one UI across all rooms; standardised build and acceptance-test scripts.</w:t>
             </w:r>
           </w:p>
         </w:tc>
@@ -1498,9 +2042,9 @@
             <w:r>
               <w:rPr>
                 <w:b w:val="0"/>
-                <w:sz w:val="21"/>
+                <w:sz w:val="20"/>
               </w:rPr>
-              <w:t>Scope variation (potential ground/1st floor additions)</w:t>
+              <w:t>Scope variation (potential ground / 1st-floor additions)</w:t>
             </w:r>
           </w:p>
         </w:tc>
@@ -1513,7 +2057,7 @@
             <w:r>
               <w:rPr>
                 <w:b w:val="0"/>
-                <w:sz w:val="21"/>
+                <w:sz w:val="20"/>
               </w:rPr>
               <w:t>Medium / Medium</w:t>
             </w:r>
@@ -1528,7 +2072,7 @@
             <w:r>
               <w:rPr>
                 <w:b w:val="0"/>
-                <w:sz w:val="21"/>
+                <w:sz w:val="20"/>
               </w:rPr>
               <w:t>Scalable, repeatable room templates; formal change control to absorb additional spaces without redesign.</w:t>
             </w:r>
@@ -1545,7 +2089,7 @@
             <w:r>
               <w:rPr>
                 <w:b w:val="0"/>
-                <w:sz w:val="21"/>
+                <w:sz w:val="20"/>
               </w:rPr>
               <w:t>Accessibility requirements not fully met</w:t>
             </w:r>
@@ -1560,7 +2104,7 @@
             <w:r>
               <w:rPr>
                 <w:b w:val="0"/>
-                <w:sz w:val="21"/>
+                <w:sz w:val="20"/>
               </w:rPr>
               <w:t>Low / High</w:t>
             </w:r>
@@ -1575,9 +2119,56 @@
             <w:r>
               <w:rPr>
                 <w:b w:val="0"/>
-                <w:sz w:val="21"/>
+                <w:sz w:val="20"/>
               </w:rPr>
-              <w:t>Accessibility designed in from the outset and verified during commissioning (hearing support, reach ranges, clear UI).</w:t>
+              <w:t>Accessibility designed in from the outset and verified during commissioning (assistive listening, reach ranges, clear UI).</w:t>
+            </w:r>
+          </w:p>
+        </w:tc>
+      </w:tr>
+      <w:tr>
+        <w:tc>
+          <w:tcPr>
+            <w:tcW w:type="dxa" w:w="3168"/>
+          </w:tcPr>
+          <w:p>
+            <w:r/>
+            <w:r>
+              <w:rPr>
+                <w:b w:val="0"/>
+                <w:sz w:val="20"/>
+              </w:rPr>
+              <w:t>Named personnel unavailable</w:t>
+            </w:r>
+          </w:p>
+        </w:tc>
+        <w:tc>
+          <w:tcPr>
+            <w:tcW w:type="dxa" w:w="1872"/>
+          </w:tcPr>
+          <w:p>
+            <w:r/>
+            <w:r>
+              <w:rPr>
+                <w:b w:val="0"/>
+                <w:sz w:val="20"/>
+              </w:rPr>
+              <w:t>Low / Medium</w:t>
+            </w:r>
+          </w:p>
+        </w:tc>
+        <w:tc>
+          <w:tcPr>
+            <w:tcW w:type="dxa" w:w="4320"/>
+          </w:tcPr>
+          <w:p>
+            <w:r/>
+            <w:r>
+              <w:rPr>
+                <w:b w:val="0"/>
+                <w:sz w:val="20"/>
+              </w:rPr>
+              <w:t>Every key role has a named deputy; cross-trained engineering pool of 18+ FTE.</w:t>
             </w:r>
           </w:p>
         </w:tc>
@@ -1598,7 +2189,7 @@
     </w:p>
     <w:p>
       <w:r>
-        <w:t>[Company Name] will provide an experienced, appropriately skilled team for the duration of the project and a structured contract management and support regime for the operational life of the solution. The same Account/Contract Manager and Project Manager will provide continuity from award through to ongoing support.</w:t>
+        <w:t>Stacked Ltd provides an experienced, certified team for the delivery of the project and a structured, ITIL-aligned contract-management and support regime for the operational life of the installed solution. The same Account Manager (Michael Koulis) and senior team provide continuity from award through delivery and into ongoing support, so SOLAS never has to navigate our internal structure to get something done.</w:t>
       </w:r>
     </w:p>
     <w:p>
@@ -1611,7 +2202,7 @@
     </w:p>
     <w:p>
       <w:r>
-        <w:t>The core team proposed for this engagement, and available throughout the project, is set out below. CVs / profiles evidencing relevant experience and accreditations are provided for each named individual.</w:t>
+        <w:t>The core team proposed for this engagement, and available throughout the project and the subsequent support term, is set out below. Full CVs (each ≤ 2 A4 pages) are available on request. The team’s directly relevant reference estates include the Courts Service of Ireland (100+ courtrooms, ≥ 99.5% uptime), the Department of Foreign Affairs (Iveagh House / Bishops Square, 65 rooms), Tailte Éireann (Smithfield Hall, 20+ rooms) and Trinity College Dublin.</w:t>
       </w:r>
     </w:p>
     <w:tbl>
@@ -1629,7 +2220,7 @@
       <w:tr>
         <w:tc>
           <w:tcPr>
-            <w:tcW w:type="dxa" w:w="2736"/>
+            <w:tcW w:type="dxa" w:w="2448"/>
             <w:shd w:val="clear" w:fill="1F3364"/>
           </w:tcPr>
           <w:p>
@@ -1638,26 +2229,9 @@
               <w:rPr>
                 <w:b/>
                 <w:color w:val="FFFFFF"/>
-                <w:sz w:val="21"/>
+                <w:sz w:val="20"/>
               </w:rPr>
-              <w:t>Role</w:t>
-            </w:r>
-          </w:p>
-        </w:tc>
-        <w:tc>
-          <w:tcPr>
-            <w:tcW w:type="dxa" w:w="3888"/>
-            <w:shd w:val="clear" w:fill="1F3364"/>
-          </w:tcPr>
-          <w:p>
-            <w:r/>
-            <w:r>
-              <w:rPr>
-                <w:b/>
-                <w:color w:val="FFFFFF"/>
-                <w:sz w:val="21"/>
-              </w:rPr>
-              <w:t>Responsibilities</w:t>
+              <w:t>Name / Role</w:t>
             </w:r>
           </w:p>
         </w:tc>
@@ -1672,9 +2246,26 @@
               <w:rPr>
                 <w:b/>
                 <w:color w:val="FFFFFF"/>
-                <w:sz w:val="21"/>
+                <w:sz w:val="20"/>
               </w:rPr>
-              <w:t>Relevant Experience</w:t>
+              <w:t>Key credentials</w:t>
+            </w:r>
+          </w:p>
+        </w:tc>
+        <w:tc>
+          <w:tcPr>
+            <w:tcW w:type="dxa" w:w="4176"/>
+            <w:shd w:val="clear" w:fill="1F3364"/>
+          </w:tcPr>
+          <w:p>
+            <w:r/>
+            <w:r>
+              <w:rPr>
+                <w:b/>
+                <w:color w:val="FFFFFF"/>
+                <w:sz w:val="20"/>
+              </w:rPr>
+              <w:t>Responsibility &amp; relevant experience</w:t>
             </w:r>
           </w:p>
         </w:tc>
@@ -1682,31 +2273,25 @@
       <w:tr>
         <w:tc>
           <w:tcPr>
-            <w:tcW w:type="dxa" w:w="2736"/>
+            <w:tcW w:type="dxa" w:w="2448"/>
           </w:tcPr>
           <w:p>
             <w:r/>
             <w:r>
               <w:rPr>
                 <w:b w:val="0"/>
-                <w:sz w:val="21"/>
+                <w:sz w:val="20"/>
               </w:rPr>
-              <w:t>Account / Contract Manager</w:t>
+              <w:t>Gavin Byrne</w:t>
             </w:r>
           </w:p>
-        </w:tc>
-        <w:tc>
-          <w:tcPr>
-            <w:tcW w:type="dxa" w:w="3888"/>
-          </w:tcPr>
           <w:p>
-            <w:r/>
             <w:r>
               <w:rPr>
                 <w:b w:val="0"/>
-                <w:sz w:val="21"/>
+                <w:sz w:val="20"/>
               </w:rPr>
-              <w:t>Single point of commercial contact; contract governance; service reviews; continuity into support.</w:t>
+              <w:t>Executive Sponsor (COO)</w:t>
             </w:r>
           </w:p>
         </w:tc>
@@ -1719,9 +2304,24 @@
             <w:r>
               <w:rPr>
                 <w:b w:val="0"/>
-                <w:sz w:val="21"/>
+                <w:sz w:val="20"/>
               </w:rPr>
-              <w:t>[Years] years; [reference contracts of similar scale].</w:t>
+              <w:t>—</w:t>
+            </w:r>
+          </w:p>
+        </w:tc>
+        <w:tc>
+          <w:tcPr>
+            <w:tcW w:type="dxa" w:w="4176"/>
+          </w:tcPr>
+          <w:p>
+            <w:r/>
+            <w:r>
+              <w:rPr>
+                <w:b w:val="0"/>
+                <w:sz w:val="20"/>
+              </w:rPr>
+              <w:t>Executive accountability; signs the contract; Tier-4 escalation. Oversees Stacked’s public-sector portfolio (Courts Service, DFA, Tailte Éireann, TCD, University of Galway).</w:t>
             </w:r>
           </w:p>
         </w:tc>
@@ -1729,31 +2329,25 @@
       <w:tr>
         <w:tc>
           <w:tcPr>
-            <w:tcW w:type="dxa" w:w="2736"/>
+            <w:tcW w:type="dxa" w:w="2448"/>
           </w:tcPr>
           <w:p>
             <w:r/>
             <w:r>
               <w:rPr>
                 <w:b w:val="0"/>
-                <w:sz w:val="21"/>
+                <w:sz w:val="20"/>
               </w:rPr>
-              <w:t>Project Manager</w:t>
+              <w:t>Michael Koulis</w:t>
             </w:r>
           </w:p>
-        </w:tc>
-        <w:tc>
-          <w:tcPr>
-            <w:tcW w:type="dxa" w:w="3888"/>
-          </w:tcPr>
           <w:p>
-            <w:r/>
             <w:r>
               <w:rPr>
                 <w:b w:val="0"/>
-                <w:sz w:val="21"/>
+                <w:sz w:val="20"/>
               </w:rPr>
-              <w:t>Owns the project plan, schedule, reporting, risk and change control; primary delivery contact for SOLAS.</w:t>
+              <w:t>Key Account Manager</w:t>
             </w:r>
           </w:p>
         </w:tc>
@@ -1766,9 +2360,24 @@
             <w:r>
               <w:rPr>
                 <w:b w:val="0"/>
-                <w:sz w:val="21"/>
+                <w:sz w:val="20"/>
               </w:rPr>
-              <w:t>[PRINCE2/PMP]; [comparable AV fit-out projects].</w:t>
+              <w:t>—</w:t>
+            </w:r>
+          </w:p>
+        </w:tc>
+        <w:tc>
+          <w:tcPr>
+            <w:tcW w:type="dxa" w:w="4176"/>
+          </w:tcPr>
+          <w:p>
+            <w:r/>
+            <w:r>
+              <w:rPr>
+                <w:b w:val="0"/>
+                <w:sz w:val="20"/>
+              </w:rPr>
+              <w:t>Single point of contact for SOLAS; chairs reviews; signs off the KPI pack. Named Account Manager on the Courts Service contract (49 courtrooms).</w:t>
             </w:r>
           </w:p>
         </w:tc>
@@ -1776,31 +2385,25 @@
       <w:tr>
         <w:tc>
           <w:tcPr>
-            <w:tcW w:type="dxa" w:w="2736"/>
+            <w:tcW w:type="dxa" w:w="2448"/>
           </w:tcPr>
           <w:p>
             <w:r/>
             <w:r>
               <w:rPr>
                 <w:b w:val="0"/>
-                <w:sz w:val="21"/>
+                <w:sz w:val="20"/>
               </w:rPr>
-              <w:t>Lead AV / Design Engineer</w:t>
+              <w:t>Conor Friel</w:t>
             </w:r>
           </w:p>
-        </w:tc>
-        <w:tc>
-          <w:tcPr>
-            <w:tcW w:type="dxa" w:w="3888"/>
-          </w:tcPr>
           <w:p>
-            <w:r/>
             <w:r>
               <w:rPr>
                 <w:b w:val="0"/>
-                <w:sz w:val="21"/>
+                <w:sz w:val="20"/>
               </w:rPr>
-              <w:t>Detailed design; standardisation; integration with M365/Teams and Clearooms; commissioning oversight.</w:t>
+              <w:t>Head of AV Design</w:t>
             </w:r>
           </w:p>
         </w:tc>
@@ -1813,9 +2416,24 @@
             <w:r>
               <w:rPr>
                 <w:b w:val="0"/>
-                <w:sz w:val="21"/>
+                <w:sz w:val="20"/>
               </w:rPr>
-              <w:t>[Manufacturer accreditations, e.g. AVIXA CTS]; [similar projects].</w:t>
+              <w:t>Crestron Certified Programmer; Extron Control Specialist; ITIL Foundation</w:t>
+            </w:r>
+          </w:p>
+        </w:tc>
+        <w:tc>
+          <w:tcPr>
+            <w:tcW w:type="dxa" w:w="4176"/>
+          </w:tcPr>
+          <w:p>
+            <w:r/>
+            <w:r>
+              <w:rPr>
+                <w:b w:val="0"/>
+                <w:sz w:val="20"/>
+              </w:rPr>
+              <w:t>Detailed design, standardisation and commissioning sign-off. Sole designer of Tailte Éireann Smithfield Hall and the DFA 65-room deployment; specifies Microsoft Teams Rooms architecture.</w:t>
             </w:r>
           </w:p>
         </w:tc>
@@ -1823,31 +2441,25 @@
       <w:tr>
         <w:tc>
           <w:tcPr>
-            <w:tcW w:type="dxa" w:w="2736"/>
+            <w:tcW w:type="dxa" w:w="2448"/>
           </w:tcPr>
           <w:p>
             <w:r/>
             <w:r>
               <w:rPr>
                 <w:b w:val="0"/>
-                <w:sz w:val="21"/>
+                <w:sz w:val="20"/>
               </w:rPr>
-              <w:t>Installation Team</w:t>
+              <w:t>Jason McCourt</w:t>
             </w:r>
           </w:p>
-        </w:tc>
-        <w:tc>
-          <w:tcPr>
-            <w:tcW w:type="dxa" w:w="3888"/>
-          </w:tcPr>
           <w:p>
-            <w:r/>
             <w:r>
               <w:rPr>
                 <w:b w:val="0"/>
-                <w:sz w:val="21"/>
+                <w:sz w:val="20"/>
               </w:rPr>
-              <w:t>Cabling, mounting, hardware installation and on-site integration.</w:t>
+              <w:t>AV Solutions Architect</w:t>
             </w:r>
           </w:p>
         </w:tc>
@@ -1860,9 +2472,24 @@
             <w:r>
               <w:rPr>
                 <w:b w:val="0"/>
-                <w:sz w:val="21"/>
+                <w:sz w:val="20"/>
               </w:rPr>
-              <w:t>[Certified installers]; safe-pass / relevant site certifications.</w:t>
+              <w:t>AVIXA CTS; Crestron, Cisco, Logitech, Poly, Q-Sys, Biamp certified</w:t>
+            </w:r>
+          </w:p>
+        </w:tc>
+        <w:tc>
+          <w:tcPr>
+            <w:tcW w:type="dxa" w:w="4176"/>
+          </w:tcPr>
+          <w:p>
+            <w:r/>
+            <w:r>
+              <w:rPr>
+                <w:b w:val="0"/>
+                <w:sz w:val="20"/>
+              </w:rPr>
+              <w:t>Room-by-room surveys and specifications. 20+ years’ AV design across education and enterprise; survey lead on DFA and Coca-Cola Irish HQ.</w:t>
             </w:r>
           </w:p>
         </w:tc>
@@ -1870,31 +2497,25 @@
       <w:tr>
         <w:tc>
           <w:tcPr>
-            <w:tcW w:type="dxa" w:w="2736"/>
+            <w:tcW w:type="dxa" w:w="2448"/>
           </w:tcPr>
           <w:p>
             <w:r/>
             <w:r>
               <w:rPr>
                 <w:b w:val="0"/>
-                <w:sz w:val="21"/>
+                <w:sz w:val="20"/>
               </w:rPr>
-              <w:t>Commissioning Engineer</w:t>
+              <w:t>Gillian McCann</w:t>
             </w:r>
           </w:p>
-        </w:tc>
-        <w:tc>
-          <w:tcPr>
-            <w:tcW w:type="dxa" w:w="3888"/>
-          </w:tcPr>
           <w:p>
-            <w:r/>
             <w:r>
               <w:rPr>
                 <w:b w:val="0"/>
-                <w:sz w:val="21"/>
+                <w:sz w:val="20"/>
               </w:rPr>
-              <w:t>Functional and acceptance testing; accessibility and call-quality verification.</w:t>
+              <w:t>Head of Projects</w:t>
             </w:r>
           </w:p>
         </w:tc>
@@ -1907,9 +2528,24 @@
             <w:r>
               <w:rPr>
                 <w:b w:val="0"/>
-                <w:sz w:val="21"/>
+                <w:sz w:val="20"/>
               </w:rPr>
-              <w:t>[Relevant accreditations].</w:t>
+              <w:t>PRINCE2 Practitioner</w:t>
+            </w:r>
+          </w:p>
+        </w:tc>
+        <w:tc>
+          <w:tcPr>
+            <w:tcW w:type="dxa" w:w="4176"/>
+          </w:tcPr>
+          <w:p>
+            <w:r/>
+            <w:r>
+              <w:rPr>
+                <w:b w:val="0"/>
+                <w:sz w:val="20"/>
+              </w:rPr>
+              <w:t>Project governance and scheduling. Managed the Courts Service nationwide rollout (€2.95m, 100+ courtrooms); coordinates all active public-sector programmes.</w:t>
             </w:r>
           </w:p>
         </w:tc>
@@ -1917,31 +2553,25 @@
       <w:tr>
         <w:tc>
           <w:tcPr>
-            <w:tcW w:type="dxa" w:w="2736"/>
+            <w:tcW w:type="dxa" w:w="2448"/>
           </w:tcPr>
           <w:p>
             <w:r/>
             <w:r>
               <w:rPr>
                 <w:b w:val="0"/>
-                <w:sz w:val="21"/>
+                <w:sz w:val="20"/>
               </w:rPr>
-              <w:t>Support / Service Desk Lead</w:t>
+              <w:t>Niamh O’Farrell</w:t>
             </w:r>
           </w:p>
-        </w:tc>
-        <w:tc>
-          <w:tcPr>
-            <w:tcW w:type="dxa" w:w="3888"/>
-          </w:tcPr>
           <w:p>
-            <w:r/>
             <w:r>
               <w:rPr>
                 <w:b w:val="0"/>
-                <w:sz w:val="21"/>
+                <w:sz w:val="20"/>
               </w:rPr>
-              <w:t>Owns the support relationship, SLAs, maintenance and escalation.</w:t>
+              <w:t>Lead Project Manager</w:t>
             </w:r>
           </w:p>
         </w:tc>
@@ -1954,9 +2584,304 @@
             <w:r>
               <w:rPr>
                 <w:b w:val="0"/>
-                <w:sz w:val="21"/>
+                <w:sz w:val="20"/>
               </w:rPr>
-              <w:t>[ITIL]; service management experience.</w:t>
+              <w:t>PRINCE2 Practitioner</w:t>
+            </w:r>
+          </w:p>
+        </w:tc>
+        <w:tc>
+          <w:tcPr>
+            <w:tcW w:type="dxa" w:w="4176"/>
+          </w:tcPr>
+          <w:p>
+            <w:r/>
+            <w:r>
+              <w:rPr>
+                <w:b w:val="0"/>
+                <w:sz w:val="20"/>
+              </w:rPr>
+              <w:t>Day-to-day install manager; SOLAS liaison; owns the schedule and progress report. Delivered the DFA Bishops Square install in an active government building under silent-works constraints.</w:t>
+            </w:r>
+          </w:p>
+        </w:tc>
+      </w:tr>
+      <w:tr>
+        <w:tc>
+          <w:tcPr>
+            <w:tcW w:type="dxa" w:w="2448"/>
+          </w:tcPr>
+          <w:p>
+            <w:r/>
+            <w:r>
+              <w:rPr>
+                <w:b w:val="0"/>
+                <w:sz w:val="20"/>
+              </w:rPr>
+              <w:t>Paul Rochester</w:t>
+            </w:r>
+          </w:p>
+          <w:p>
+            <w:r>
+              <w:rPr>
+                <w:b w:val="0"/>
+                <w:sz w:val="20"/>
+              </w:rPr>
+              <w:t>Field Engineering Lead / Commissioning</w:t>
+            </w:r>
+          </w:p>
+        </w:tc>
+        <w:tc>
+          <w:tcPr>
+            <w:tcW w:type="dxa" w:w="2736"/>
+          </w:tcPr>
+          <w:p>
+            <w:r/>
+            <w:r>
+              <w:rPr>
+                <w:b w:val="0"/>
+                <w:sz w:val="20"/>
+              </w:rPr>
+              <w:t>BEng; Crestron CP301; Extron ProDSP / Control / Network; Cisco VC</w:t>
+            </w:r>
+          </w:p>
+        </w:tc>
+        <w:tc>
+          <w:tcPr>
+            <w:tcW w:type="dxa" w:w="4176"/>
+          </w:tcPr>
+          <w:p>
+            <w:r/>
+            <w:r>
+              <w:rPr>
+                <w:b w:val="0"/>
+                <w:sz w:val="20"/>
+              </w:rPr>
+              <w:t>On-site install, programming and commissioning; Level-1 training. Programmed AV upgrades for TCD and the Courts Service; led commissioning on all 65 DFA rooms.</w:t>
+            </w:r>
+          </w:p>
+        </w:tc>
+      </w:tr>
+      <w:tr>
+        <w:tc>
+          <w:tcPr>
+            <w:tcW w:type="dxa" w:w="2448"/>
+          </w:tcPr>
+          <w:p>
+            <w:r/>
+            <w:r>
+              <w:rPr>
+                <w:b w:val="0"/>
+                <w:sz w:val="20"/>
+              </w:rPr>
+              <w:t>Alan Doyle</w:t>
+            </w:r>
+          </w:p>
+          <w:p>
+            <w:r>
+              <w:rPr>
+                <w:b w:val="0"/>
+                <w:sz w:val="20"/>
+              </w:rPr>
+              <w:t>Field Engineer — Cabling &amp; Signal</w:t>
+            </w:r>
+          </w:p>
+        </w:tc>
+        <w:tc>
+          <w:tcPr>
+            <w:tcW w:type="dxa" w:w="2736"/>
+          </w:tcPr>
+          <w:p>
+            <w:r/>
+            <w:r>
+              <w:rPr>
+                <w:b w:val="0"/>
+                <w:sz w:val="20"/>
+              </w:rPr>
+              <w:t>9 Extron / AMX certifications</w:t>
+            </w:r>
+          </w:p>
+        </w:tc>
+        <w:tc>
+          <w:tcPr>
+            <w:tcW w:type="dxa" w:w="4176"/>
+          </w:tcPr>
+          <w:p>
+            <w:r/>
+            <w:r>
+              <w:rPr>
+                <w:b w:val="0"/>
+                <w:sz w:val="20"/>
+              </w:rPr>
+              <w:t>Signal distribution, structured cabling (Cat6A, HDBaseT, fibre), audio calibration, cable certification to ET101. Co-leads end-user training.</w:t>
+            </w:r>
+          </w:p>
+        </w:tc>
+      </w:tr>
+      <w:tr>
+        <w:tc>
+          <w:tcPr>
+            <w:tcW w:type="dxa" w:w="2448"/>
+          </w:tcPr>
+          <w:p>
+            <w:r/>
+            <w:r>
+              <w:rPr>
+                <w:b w:val="0"/>
+                <w:sz w:val="20"/>
+              </w:rPr>
+              <w:t>Nils Defossez</w:t>
+            </w:r>
+          </w:p>
+          <w:p>
+            <w:r>
+              <w:rPr>
+                <w:b w:val="0"/>
+                <w:sz w:val="20"/>
+              </w:rPr>
+              <w:t>AV Service Manager</w:t>
+            </w:r>
+          </w:p>
+        </w:tc>
+        <w:tc>
+          <w:tcPr>
+            <w:tcW w:type="dxa" w:w="2736"/>
+          </w:tcPr>
+          <w:p>
+            <w:r/>
+            <w:r>
+              <w:rPr>
+                <w:b w:val="0"/>
+                <w:sz w:val="20"/>
+              </w:rPr>
+              <w:t>Crestron DMC-D-NVX; Crestron Flex for Microsoft Teams Rooms; IVC-D; DMC-E-4K; CTI-P101</w:t>
+            </w:r>
+          </w:p>
+        </w:tc>
+        <w:tc>
+          <w:tcPr>
+            <w:tcW w:type="dxa" w:w="4176"/>
+          </w:tcPr>
+          <w:p>
+            <w:r/>
+            <w:r>
+              <w:rPr>
+                <w:b w:val="0"/>
+                <w:sz w:val="20"/>
+              </w:rPr>
+              <w:t>Owns the SOLAS Service Desk and SLA tracking; Tier-3 technical escalation; OEM technical-support relationships (Cisco TAC, Crestron, Barco, QSC, Biamp).</w:t>
+            </w:r>
+          </w:p>
+        </w:tc>
+      </w:tr>
+      <w:tr>
+        <w:tc>
+          <w:tcPr>
+            <w:tcW w:type="dxa" w:w="2448"/>
+          </w:tcPr>
+          <w:p>
+            <w:r/>
+            <w:r>
+              <w:rPr>
+                <w:b w:val="0"/>
+                <w:sz w:val="20"/>
+              </w:rPr>
+              <w:t>Warren Hannigan</w:t>
+            </w:r>
+          </w:p>
+          <w:p>
+            <w:r>
+              <w:rPr>
+                <w:b w:val="0"/>
+                <w:sz w:val="20"/>
+              </w:rPr>
+              <w:t>Head of Service</w:t>
+            </w:r>
+          </w:p>
+        </w:tc>
+        <w:tc>
+          <w:tcPr>
+            <w:tcW w:type="dxa" w:w="2736"/>
+          </w:tcPr>
+          <w:p>
+            <w:r/>
+            <w:r>
+              <w:rPr>
+                <w:b w:val="0"/>
+                <w:sz w:val="20"/>
+              </w:rPr>
+              <w:t>ITIL Foundation; ConnectWise certified</w:t>
+            </w:r>
+          </w:p>
+        </w:tc>
+        <w:tc>
+          <w:tcPr>
+            <w:tcW w:type="dxa" w:w="4176"/>
+          </w:tcPr>
+          <w:p>
+            <w:r/>
+            <w:r>
+              <w:rPr>
+                <w:b w:val="0"/>
+                <w:sz w:val="20"/>
+              </w:rPr>
+              <w:t>SLA compliance and service governance; Tier-3 service escalation owner. Runs the Courts Service SLA achieving ≥ 99.5% uptime across 100+ courtrooms.</w:t>
+            </w:r>
+          </w:p>
+        </w:tc>
+      </w:tr>
+      <w:tr>
+        <w:tc>
+          <w:tcPr>
+            <w:tcW w:type="dxa" w:w="2448"/>
+          </w:tcPr>
+          <w:p>
+            <w:r/>
+            <w:r>
+              <w:rPr>
+                <w:b w:val="0"/>
+                <w:sz w:val="20"/>
+              </w:rPr>
+              <w:t>Joanna Morgan</w:t>
+            </w:r>
+          </w:p>
+          <w:p>
+            <w:r>
+              <w:rPr>
+                <w:b w:val="0"/>
+                <w:sz w:val="20"/>
+              </w:rPr>
+              <w:t>Operations &amp; Quality Manager</w:t>
+            </w:r>
+          </w:p>
+        </w:tc>
+        <w:tc>
+          <w:tcPr>
+            <w:tcW w:type="dxa" w:w="2736"/>
+          </w:tcPr>
+          <w:p>
+            <w:r/>
+            <w:r>
+              <w:rPr>
+                <w:b w:val="0"/>
+                <w:sz w:val="20"/>
+              </w:rPr>
+              <w:t>ISO 9001 / 14001 lead</w:t>
+            </w:r>
+          </w:p>
+        </w:tc>
+        <w:tc>
+          <w:tcPr>
+            <w:tcW w:type="dxa" w:w="4176"/>
+          </w:tcPr>
+          <w:p>
+            <w:r/>
+            <w:r>
+              <w:rPr>
+                <w:b w:val="0"/>
+                <w:sz w:val="20"/>
+              </w:rPr>
+              <w:t>Quality, H&amp;S and environmental compliance; issues site-specific RAMS and Safety Statements; owns CAPA records.</w:t>
             </w:r>
           </w:p>
         </w:tc>
@@ -1968,7 +2893,7 @@
           <w:i/>
           <w:color w:val="C00000"/>
         </w:rPr>
-        <w:t>[Insert named individuals and attach CVs. Reference 2–3 comparable AV projects (ideally public sector / similar room mix) with outcomes — mirror the reference sites used in your TCD response.]</w:t>
+        <w:t>[Confirm the final named team and attach CVs. Adjust reference contracts to those you wish to cite for SOLAS.]</w:t>
       </w:r>
     </w:p>
     <w:p>
@@ -1981,47 +2906,156 @@
     </w:p>
     <w:p>
       <w:r>
-        <w:t>Following handover, [Company Name] will provide a comprehensive support service for the standardised AV estate. Our support model comprises:</w:t>
+        <w:t>Following handover, Stacked Ltd provides a single, ITIL-aligned support service for the standardised SOLAS AV estate, owned day-to-day by Nils Defossez (AV Service Manager) with Warren Hannigan (Head of Service) as the Tier-3 / customer-facing owner. All incidents and requests flow through one ConnectWise ticket that follows the issue from logging, through remote triage and on-site dispatch, to verified resolution.</w:t>
       </w:r>
     </w:p>
+    <w:tbl>
+      <w:tblPr>
+        <w:tblStyle w:val="TableGrid"/>
+        <w:tblW w:type="auto" w:w="0"/>
+        <w:jc w:val="center"/>
+        <w:tblLook w:firstColumn="1" w:firstRow="1" w:lastColumn="0" w:lastRow="0" w:noHBand="0" w:noVBand="1" w:val="04A0"/>
+      </w:tblPr>
+      <w:tblGrid>
+        <w:gridCol w:w="4320"/>
+        <w:gridCol w:w="4320"/>
+      </w:tblGrid>
+      <w:tr>
+        <w:tc>
+          <w:tcPr>
+            <w:tcW w:type="dxa" w:w="2016"/>
+            <w:shd w:val="clear" w:fill="1F3364"/>
+          </w:tcPr>
+          <w:p>
+            <w:r/>
+            <w:r>
+              <w:rPr>
+                <w:b/>
+                <w:color w:val="FFFFFF"/>
+                <w:sz w:val="20"/>
+              </w:rPr>
+              <w:t>Channel</w:t>
+            </w:r>
+          </w:p>
+        </w:tc>
+        <w:tc>
+          <w:tcPr>
+            <w:tcW w:type="dxa" w:w="7344"/>
+            <w:shd w:val="clear" w:fill="1F3364"/>
+          </w:tcPr>
+          <w:p>
+            <w:r/>
+            <w:r>
+              <w:rPr>
+                <w:b/>
+                <w:color w:val="FFFFFF"/>
+                <w:sz w:val="20"/>
+              </w:rPr>
+              <w:t>How it works</w:t>
+            </w:r>
+          </w:p>
+        </w:tc>
+      </w:tr>
+      <w:tr>
+        <w:tc>
+          <w:tcPr>
+            <w:tcW w:type="dxa" w:w="2016"/>
+          </w:tcPr>
+          <w:p>
+            <w:r/>
+            <w:r>
+              <w:rPr>
+                <w:b w:val="0"/>
+                <w:sz w:val="20"/>
+              </w:rPr>
+              <w:t>Telephone</w:t>
+            </w:r>
+          </w:p>
+        </w:tc>
+        <w:tc>
+          <w:tcPr>
+            <w:tcW w:type="dxa" w:w="7344"/>
+          </w:tcPr>
+          <w:p>
+            <w:r/>
+            <w:r>
+              <w:rPr>
+                <w:b w:val="0"/>
+                <w:sz w:val="20"/>
+              </w:rPr>
+              <w:t>Dedicated SOLAS support line answered live by a named operator during support hours; target answer ≤ 30 seconds.</w:t>
+            </w:r>
+          </w:p>
+        </w:tc>
+      </w:tr>
+      <w:tr>
+        <w:tc>
+          <w:tcPr>
+            <w:tcW w:type="dxa" w:w="2016"/>
+          </w:tcPr>
+          <w:p>
+            <w:r/>
+            <w:r>
+              <w:rPr>
+                <w:b w:val="0"/>
+                <w:sz w:val="20"/>
+              </w:rPr>
+              <w:t>Email</w:t>
+            </w:r>
+          </w:p>
+        </w:tc>
+        <w:tc>
+          <w:tcPr>
+            <w:tcW w:type="dxa" w:w="7344"/>
+          </w:tcPr>
+          <w:p>
+            <w:r/>
+            <w:r>
+              <w:rPr>
+                <w:b w:val="0"/>
+                <w:sz w:val="20"/>
+              </w:rPr>
+              <w:t>SOLAS-dedicated mailbox; auto-acknowledgement with a ticket number within 1 minute; operator response within 30 minutes during support hours.</w:t>
+            </w:r>
+          </w:p>
+        </w:tc>
+      </w:tr>
+      <w:tr>
+        <w:tc>
+          <w:tcPr>
+            <w:tcW w:type="dxa" w:w="2016"/>
+          </w:tcPr>
+          <w:p>
+            <w:r/>
+            <w:r>
+              <w:rPr>
+                <w:b w:val="0"/>
+                <w:sz w:val="20"/>
+              </w:rPr>
+              <w:t>Web portal</w:t>
+            </w:r>
+          </w:p>
+        </w:tc>
+        <w:tc>
+          <w:tcPr>
+            <w:tcW w:type="dxa" w:w="7344"/>
+          </w:tcPr>
+          <w:p>
+            <w:r/>
+            <w:r>
+              <w:rPr>
+                <w:b w:val="0"/>
+                <w:sz w:val="20"/>
+              </w:rPr>
+              <w:t>SOLAS-authorised users get named logins to the ConnectWise self-service portal to raise, track, comment on and reopen tickets, and view real-time SLA status.</w:t>
+            </w:r>
+          </w:p>
+        </w:tc>
+      </w:tr>
+    </w:tbl>
     <w:p>
-      <w:pPr>
-        <w:pStyle w:val="ListBullet"/>
-      </w:pPr>
       <w:r>
-        <w:t>A single, named service desk as the central point of contact for all incidents and requests, accessible by phone, email and online portal.</w:t>
-      </w:r>
-    </w:p>
-    <w:p>
-      <w:pPr>
-        <w:pStyle w:val="ListBullet"/>
-      </w:pPr>
-      <w:r>
-        <w:t>Logging, tracking and reporting of all tickets through our service management system, with reference numbers and status visibility for SOLAS.</w:t>
-      </w:r>
-    </w:p>
-    <w:p>
-      <w:pPr>
-        <w:pStyle w:val="ListBullet"/>
-      </w:pPr>
-      <w:r>
-        <w:t>Remote diagnostics and resolution where possible to minimise downtime, with on-site attendance where required.</w:t>
-      </w:r>
-    </w:p>
-    <w:p>
-      <w:pPr>
-        <w:pStyle w:val="ListBullet"/>
-      </w:pPr>
-      <w:r>
-        <w:t>Standard support hours of [e.g. 08:00–18:00, Monday–Friday], with optional extended cover for major SOLAS events.</w:t>
-      </w:r>
-    </w:p>
-    <w:p>
-      <w:pPr>
-        <w:pStyle w:val="ListBullet"/>
-      </w:pPr>
-      <w:r>
-        <w:t>Regular service review meetings with the SOLAS contract owner, including performance against SLAs and continual improvement actions.</w:t>
+        <w:t>Our Service Desk is remote-first: operators have pre-agreed remote access (ConnectWise Control / VPN) to Crestron control, Cisco endpoints and the supporting network, and attempt remote resolution as the first action on every incident. Across our existing public-sector estate the current year-to-date remote-fix rate is 76.92%, meaning roughly three in four issues are resolved without an engineer site visit. Standard support hours are 08:00–18:00, Monday–Friday, with optional out-of-hours cover available for major SOLAS events.</w:t>
       </w:r>
     </w:p>
     <w:p>
@@ -2030,7 +3064,7 @@
           <w:i/>
           <w:color w:val="C00000"/>
         </w:rPr>
-        <w:t>[Confirm support hours, portal/contact details and reporting cadence to match your standard managed-service offering.]</w:t>
+        <w:t>[Confirm support hours and whether out-of-hours event cover is included in the base offer or priced as an option.]</w:t>
       </w:r>
     </w:p>
     <w:p>
@@ -2043,7 +3077,303 @@
     </w:p>
     <w:p>
       <w:r>
-        <w:t>Incidents are prioritised by business impact, with target response and resolution times as set out below. SLA performance is reported at each service review.</w:t>
+        <w:t>Incidents are prioritised by business impact. As Castleforbes House is a single Dublin site covered from our Robinhood Road operations base (~30 minutes away), we commit to the following on-site response times, measured from the time SOLAS logs the call to a Stacked engineer being on-site:</w:t>
+      </w:r>
+    </w:p>
+    <w:tbl>
+      <w:tblPr>
+        <w:tblStyle w:val="TableGrid"/>
+        <w:tblW w:type="auto" w:w="0"/>
+        <w:jc w:val="center"/>
+        <w:tblLook w:firstColumn="1" w:firstRow="1" w:lastColumn="0" w:lastRow="0" w:noHBand="0" w:noVBand="1" w:val="04A0"/>
+      </w:tblPr>
+      <w:tblGrid>
+        <w:gridCol w:w="2880"/>
+        <w:gridCol w:w="2880"/>
+        <w:gridCol w:w="2880"/>
+      </w:tblGrid>
+      <w:tr>
+        <w:tc>
+          <w:tcPr>
+            <w:tcW w:type="dxa" w:w="4320"/>
+            <w:shd w:val="clear" w:fill="1F3364"/>
+          </w:tcPr>
+          <w:p>
+            <w:r/>
+            <w:r>
+              <w:rPr>
+                <w:b/>
+                <w:color w:val="FFFFFF"/>
+                <w:sz w:val="20"/>
+              </w:rPr>
+              <w:t>Call type</w:t>
+            </w:r>
+          </w:p>
+        </w:tc>
+        <w:tc>
+          <w:tcPr>
+            <w:tcW w:type="dxa" w:w="2448"/>
+            <w:shd w:val="clear" w:fill="1F3364"/>
+          </w:tcPr>
+          <w:p>
+            <w:r/>
+            <w:r>
+              <w:rPr>
+                <w:b/>
+                <w:color w:val="FFFFFF"/>
+                <w:sz w:val="20"/>
+              </w:rPr>
+              <w:t>Target on-site response</w:t>
+            </w:r>
+          </w:p>
+        </w:tc>
+        <w:tc>
+          <w:tcPr>
+            <w:tcW w:type="dxa" w:w="2592"/>
+            <w:shd w:val="clear" w:fill="1F3364"/>
+          </w:tcPr>
+          <w:p>
+            <w:r/>
+            <w:r>
+              <w:rPr>
+                <w:b/>
+                <w:color w:val="FFFFFF"/>
+                <w:sz w:val="20"/>
+              </w:rPr>
+              <w:t>Notes</w:t>
+            </w:r>
+          </w:p>
+        </w:tc>
+      </w:tr>
+      <w:tr>
+        <w:tc>
+          <w:tcPr>
+            <w:tcW w:type="dxa" w:w="4320"/>
+          </w:tcPr>
+          <w:p>
+            <w:r/>
+            <w:r>
+              <w:rPr>
+                <w:b w:val="0"/>
+                <w:sz w:val="20"/>
+              </w:rPr>
+              <w:t>Emergency (room/event space down, or a live event affected)</w:t>
+            </w:r>
+          </w:p>
+        </w:tc>
+        <w:tc>
+          <w:tcPr>
+            <w:tcW w:type="dxa" w:w="2448"/>
+          </w:tcPr>
+          <w:p>
+            <w:r/>
+            <w:r>
+              <w:rPr>
+                <w:b w:val="0"/>
+                <w:sz w:val="20"/>
+              </w:rPr>
+              <w:t>Within 2 hours</w:t>
+            </w:r>
+          </w:p>
+        </w:tc>
+        <w:tc>
+          <w:tcPr>
+            <w:tcW w:type="dxa" w:w="2592"/>
+          </w:tcPr>
+          <w:p>
+            <w:r/>
+            <w:r>
+              <w:rPr>
+                <w:b w:val="0"/>
+                <w:sz w:val="20"/>
+              </w:rPr>
+              <w:t>Remote triage runs in parallel.</w:t>
+            </w:r>
+          </w:p>
+        </w:tc>
+      </w:tr>
+      <w:tr>
+        <w:tc>
+          <w:tcPr>
+            <w:tcW w:type="dxa" w:w="4320"/>
+          </w:tcPr>
+          <w:p>
+            <w:r/>
+            <w:r>
+              <w:rPr>
+                <w:b w:val="0"/>
+                <w:sz w:val="20"/>
+              </w:rPr>
+              <w:t>Standard (significant fault; workaround limited)</w:t>
+            </w:r>
+          </w:p>
+        </w:tc>
+        <w:tc>
+          <w:tcPr>
+            <w:tcW w:type="dxa" w:w="2448"/>
+          </w:tcPr>
+          <w:p>
+            <w:r/>
+            <w:r>
+              <w:rPr>
+                <w:b w:val="0"/>
+                <w:sz w:val="20"/>
+              </w:rPr>
+              <w:t>Within 4 hours</w:t>
+            </w:r>
+          </w:p>
+        </w:tc>
+        <w:tc>
+          <w:tcPr>
+            <w:tcW w:type="dxa" w:w="2592"/>
+          </w:tcPr>
+          <w:p>
+            <w:r/>
+            <w:r>
+              <w:rPr>
+                <w:b w:val="0"/>
+                <w:sz w:val="20"/>
+              </w:rPr>
+              <w:t>Most resolved remotely first.</w:t>
+            </w:r>
+          </w:p>
+        </w:tc>
+      </w:tr>
+      <w:tr>
+        <w:tc>
+          <w:tcPr>
+            <w:tcW w:type="dxa" w:w="4320"/>
+          </w:tcPr>
+          <w:p>
+            <w:r/>
+            <w:r>
+              <w:rPr>
+                <w:b w:val="0"/>
+                <w:sz w:val="20"/>
+              </w:rPr>
+              <w:t>Remote-resolvable issues</w:t>
+            </w:r>
+          </w:p>
+        </w:tc>
+        <w:tc>
+          <w:tcPr>
+            <w:tcW w:type="dxa" w:w="2448"/>
+          </w:tcPr>
+          <w:p>
+            <w:r/>
+            <w:r>
+              <w:rPr>
+                <w:b w:val="0"/>
+                <w:sz w:val="20"/>
+              </w:rPr>
+              <w:t>Off-site support</w:t>
+            </w:r>
+          </w:p>
+        </w:tc>
+        <w:tc>
+          <w:tcPr>
+            <w:tcW w:type="dxa" w:w="2592"/>
+          </w:tcPr>
+          <w:p>
+            <w:r/>
+            <w:r>
+              <w:rPr>
+                <w:b w:val="0"/>
+                <w:sz w:val="20"/>
+              </w:rPr>
+              <w:t>Stops the on-site SLA clock where SOLAS IT agrees.</w:t>
+            </w:r>
+          </w:p>
+        </w:tc>
+      </w:tr>
+    </w:tbl>
+    <w:p>
+      <w:r>
+        <w:t>Stacked Ltd commits to completing repairs within one (1) working day of a call being logged where parts and access permit. Where a part has a longer manufacturer lead time, we deploy a pre-engineered, pre-tested workaround (loan unit, hot-spare or alternative signal routing) so the room remains usable while the permanent fix is sourced. SLA timers start the moment the ticket is created in ConnectWise; tickets auto-escalate as they approach target (30 minutes before breach to Nils Defossez, 15 minutes before to Warren Hannigan, on breach to the COO), and real-time SLA compliance is visible to SOLAS through the portal.</w:t>
+      </w:r>
+    </w:p>
+    <w:p>
+      <w:r>
+        <w:rPr>
+          <w:i/>
+          <w:color w:val="C00000"/>
+        </w:rPr>
+        <w:t>[These response/repair targets reflect Stacked’s standard public-sector commitments — confirm or adjust to the levels you wish to offer SOLAS.]</w:t>
+      </w:r>
+    </w:p>
+    <w:p>
+      <w:pPr>
+        <w:pStyle w:val="Heading2"/>
+      </w:pPr>
+      <w:r>
+        <w:t>3.4  Maintenance</w:t>
+      </w:r>
+    </w:p>
+    <w:p>
+      <w:r>
+        <w:t>To keep the estate reliable, secure and consistent across all rooms, we provide a planned preventative maintenance (PPM) regime alongside reactive support:</w:t>
+      </w:r>
+    </w:p>
+    <w:p>
+      <w:pPr>
+        <w:pStyle w:val="ListBullet"/>
+      </w:pPr>
+      <w:r>
+        <w:t>Scheduled PPM health checks of every room, covering firmware, signal-path verification, control feedback, audio calibration and photographic evidence, with a per-room health-check report issued to SOLAS within 5 working days of each visit.</w:t>
+      </w:r>
+    </w:p>
+    <w:p>
+      <w:pPr>
+        <w:pStyle w:val="ListBullet"/>
+      </w:pPr>
+      <w:r>
+        <w:t>Proactive remote monitoring of connected devices (e.g. via Crestron XiO Cloud and Cisco Webex Control Hub) to identify and address issues before they affect users.</w:t>
+      </w:r>
+    </w:p>
+    <w:p>
+      <w:pPr>
+        <w:pStyle w:val="ListBullet"/>
+      </w:pPr>
+      <w:r>
+        <w:t>Firmware and security updates applied in a controlled manner to maintain compatibility with Microsoft Teams / 365 and to preserve standardisation across the estate.</w:t>
+      </w:r>
+    </w:p>
+    <w:p>
+      <w:pPr>
+        <w:pStyle w:val="ListBullet"/>
+      </w:pPr>
+      <w:r>
+        <w:t>A version-controlled asset register and full service history for all installed equipment, shared with SOLAS.</w:t>
+      </w:r>
+    </w:p>
+    <w:p>
+      <w:pPr>
+        <w:pStyle w:val="ListBullet"/>
+      </w:pPr>
+      <w:r>
+        <w:t>Lifecycle and technology-refresh recommendations captured in a Recommendations Register and reviewed at service meetings.</w:t>
+      </w:r>
+    </w:p>
+    <w:p>
+      <w:r>
+        <w:rPr>
+          <w:i/>
+          <w:color w:val="C00000"/>
+        </w:rPr>
+        <w:t>[Confirm PPM frequency, e.g. quarterly or twice-yearly, for the SOLAS offer.]</w:t>
+      </w:r>
+    </w:p>
+    <w:p>
+      <w:pPr>
+        <w:pStyle w:val="Heading2"/>
+      </w:pPr>
+      <w:r>
+        <w:t>3.5  Escalation Process</w:t>
+      </w:r>
+    </w:p>
+    <w:p>
+      <w:r>
+        <w:t>Stacked Ltd operates a four-level escalation path within ConnectWise. Tickets escalate automatically against time-based triggers, and SOLAS can escalate on request at any time. Named escalation contacts and direct numbers are issued at handover and kept current.</w:t>
       </w:r>
     </w:p>
     <w:tbl>
@@ -2071,15 +3401,15 @@
               <w:rPr>
                 <w:b/>
                 <w:color w:val="FFFFFF"/>
-                <w:sz w:val="21"/>
+                <w:sz w:val="20"/>
               </w:rPr>
-              <w:t>Priority</w:t>
+              <w:t>Tier</w:t>
             </w:r>
           </w:p>
         </w:tc>
         <w:tc>
           <w:tcPr>
-            <w:tcW w:type="dxa" w:w="3744"/>
+            <w:tcW w:type="dxa" w:w="2736"/>
             <w:shd w:val="clear" w:fill="1F3364"/>
           </w:tcPr>
           <w:p>
@@ -2088,15 +3418,15 @@
               <w:rPr>
                 <w:b/>
                 <w:color w:val="FFFFFF"/>
-                <w:sz w:val="21"/>
+                <w:sz w:val="20"/>
               </w:rPr>
-              <w:t>Definition</w:t>
+              <w:t>Trigger</w:t>
             </w:r>
           </w:p>
         </w:tc>
         <w:tc>
           <w:tcPr>
-            <w:tcW w:type="dxa" w:w="1872"/>
+            <w:tcW w:type="dxa" w:w="2304"/>
             <w:shd w:val="clear" w:fill="1F3364"/>
           </w:tcPr>
           <w:p>
@@ -2105,15 +3435,15 @@
               <w:rPr>
                 <w:b/>
                 <w:color w:val="FFFFFF"/>
-                <w:sz w:val="21"/>
+                <w:sz w:val="20"/>
               </w:rPr>
-              <w:t>Target Response</w:t>
+              <w:t>Owner</w:t>
             </w:r>
           </w:p>
         </w:tc>
         <w:tc>
           <w:tcPr>
-            <w:tcW w:type="dxa" w:w="1872"/>
+            <w:tcW w:type="dxa" w:w="2448"/>
             <w:shd w:val="clear" w:fill="1F3364"/>
           </w:tcPr>
           <w:p>
@@ -2122,9 +3452,9 @@
               <w:rPr>
                 <w:b/>
                 <w:color w:val="FFFFFF"/>
-                <w:sz w:val="21"/>
+                <w:sz w:val="20"/>
               </w:rPr>
-              <w:t>Target Resolution</w:t>
+              <w:t>Action / timer</w:t>
             </w:r>
           </w:p>
         </w:tc>
@@ -2139,54 +3469,54 @@
             <w:r>
               <w:rPr>
                 <w:b w:val="0"/>
-                <w:sz w:val="21"/>
+                <w:sz w:val="20"/>
               </w:rPr>
-              <w:t>P1 – Critical</w:t>
+              <w:t>L1 – Service Desk</w:t>
             </w:r>
           </w:p>
         </w:tc>
         <w:tc>
           <w:tcPr>
-            <w:tcW w:type="dxa" w:w="3744"/>
+            <w:tcW w:type="dxa" w:w="2736"/>
           </w:tcPr>
           <w:p>
             <w:r/>
             <w:r>
               <w:rPr>
                 <w:b w:val="0"/>
-                <w:sz w:val="21"/>
+                <w:sz w:val="20"/>
               </w:rPr>
-              <w:t>Room/event space unusable, or a major event affected.</w:t>
+              <w:t>All new incidents.</w:t>
             </w:r>
           </w:p>
         </w:tc>
         <w:tc>
           <w:tcPr>
-            <w:tcW w:type="dxa" w:w="1872"/>
+            <w:tcW w:type="dxa" w:w="2304"/>
           </w:tcPr>
           <w:p>
             <w:r/>
             <w:r>
               <w:rPr>
                 <w:b w:val="0"/>
-                <w:sz w:val="21"/>
+                <w:sz w:val="20"/>
               </w:rPr>
-              <w:t>[1 hour]</w:t>
+              <w:t>Service Desk Operator (Nils Defossez owns the queue).</w:t>
             </w:r>
           </w:p>
         </w:tc>
         <w:tc>
           <w:tcPr>
-            <w:tcW w:type="dxa" w:w="1872"/>
+            <w:tcW w:type="dxa" w:w="2448"/>
           </w:tcPr>
           <w:p>
             <w:r/>
             <w:r>
               <w:rPr>
                 <w:b w:val="0"/>
-                <w:sz w:val="21"/>
+                <w:sz w:val="20"/>
               </w:rPr>
-              <w:t>[Same business day]</w:t>
+              <w:t>First-line triage and remote-fix attempt (ConnectWise + VPN).</w:t>
             </w:r>
           </w:p>
         </w:tc>
@@ -2201,54 +3531,54 @@
             <w:r>
               <w:rPr>
                 <w:b w:val="0"/>
-                <w:sz w:val="21"/>
+                <w:sz w:val="20"/>
               </w:rPr>
-              <w:t>P2 – High</w:t>
+              <w:t>L2 – Senior Engineer</w:t>
             </w:r>
           </w:p>
         </w:tc>
         <w:tc>
           <w:tcPr>
-            <w:tcW w:type="dxa" w:w="3744"/>
+            <w:tcW w:type="dxa" w:w="2736"/>
           </w:tcPr>
           <w:p>
             <w:r/>
             <w:r>
               <w:rPr>
                 <w:b w:val="0"/>
-                <w:sz w:val="21"/>
+                <w:sz w:val="20"/>
               </w:rPr>
-              <w:t>Significant feature unavailable; workaround limited.</w:t>
+              <w:t>Not resolved at L1 within 1 hr (P1) / 2 hrs (P2).</w:t>
             </w:r>
           </w:p>
         </w:tc>
         <w:tc>
           <w:tcPr>
-            <w:tcW w:type="dxa" w:w="1872"/>
+            <w:tcW w:type="dxa" w:w="2304"/>
           </w:tcPr>
           <w:p>
             <w:r/>
             <w:r>
               <w:rPr>
                 <w:b w:val="0"/>
-                <w:sz w:val="21"/>
+                <w:sz w:val="20"/>
               </w:rPr>
-              <w:t>[4 hours]</w:t>
+              <w:t>Senior Field Engineer / AV Service Manager.</w:t>
             </w:r>
           </w:p>
         </w:tc>
         <w:tc>
           <w:tcPr>
-            <w:tcW w:type="dxa" w:w="1872"/>
+            <w:tcW w:type="dxa" w:w="2448"/>
           </w:tcPr>
           <w:p>
             <w:r/>
             <w:r>
               <w:rPr>
                 <w:b w:val="0"/>
-                <w:sz w:val="21"/>
+                <w:sz w:val="20"/>
               </w:rPr>
-              <w:t>[Next business day]</w:t>
+              <w:t>Hands-on technical resolution — remote or dispatched; SLA clock visible to SOLAS.</w:t>
             </w:r>
           </w:p>
         </w:tc>
@@ -2263,54 +3593,54 @@
             <w:r>
               <w:rPr>
                 <w:b w:val="0"/>
-                <w:sz w:val="21"/>
+                <w:sz w:val="20"/>
               </w:rPr>
-              <w:t>P3 – Medium</w:t>
+              <w:t>L3 – Head of Service</w:t>
             </w:r>
           </w:p>
         </w:tc>
         <w:tc>
           <w:tcPr>
-            <w:tcW w:type="dxa" w:w="3744"/>
+            <w:tcW w:type="dxa" w:w="2736"/>
           </w:tcPr>
           <w:p>
             <w:r/>
             <w:r>
               <w:rPr>
                 <w:b w:val="0"/>
-                <w:sz w:val="21"/>
+                <w:sz w:val="20"/>
               </w:rPr>
-              <w:t>Minor fault; room usable with workaround.</w:t>
+              <w:t>SLA-breach risk / repeat incident / room down &gt;2 hrs.</w:t>
             </w:r>
           </w:p>
         </w:tc>
         <w:tc>
           <w:tcPr>
-            <w:tcW w:type="dxa" w:w="1872"/>
+            <w:tcW w:type="dxa" w:w="2304"/>
           </w:tcPr>
           <w:p>
             <w:r/>
             <w:r>
               <w:rPr>
                 <w:b w:val="0"/>
-                <w:sz w:val="21"/>
+                <w:sz w:val="20"/>
               </w:rPr>
-              <w:t>[8 hours]</w:t>
+              <w:t>Warren Hannigan, Head of Service.</w:t>
             </w:r>
           </w:p>
         </w:tc>
         <w:tc>
           <w:tcPr>
-            <w:tcW w:type="dxa" w:w="1872"/>
+            <w:tcW w:type="dxa" w:w="2448"/>
           </w:tcPr>
           <w:p>
             <w:r/>
             <w:r>
               <w:rPr>
                 <w:b w:val="0"/>
-                <w:sz w:val="21"/>
+                <w:sz w:val="20"/>
               </w:rPr>
-              <w:t>[3 business days]</w:t>
+              <w:t>Service intervention, customer comms, resource reallocation; SOLAS call within 30 minutes.</w:t>
             </w:r>
           </w:p>
         </w:tc>
@@ -2325,54 +3655,54 @@
             <w:r>
               <w:rPr>
                 <w:b w:val="0"/>
-                <w:sz w:val="21"/>
+                <w:sz w:val="20"/>
               </w:rPr>
-              <w:t>P4 – Low</w:t>
+              <w:t>L4 – COO</w:t>
             </w:r>
           </w:p>
         </w:tc>
         <w:tc>
           <w:tcPr>
-            <w:tcW w:type="dxa" w:w="3744"/>
+            <w:tcW w:type="dxa" w:w="2736"/>
           </w:tcPr>
           <w:p>
             <w:r/>
             <w:r>
               <w:rPr>
                 <w:b w:val="0"/>
-                <w:sz w:val="21"/>
+                <w:sz w:val="20"/>
               </w:rPr>
-              <w:t>Request for information or minor change.</w:t>
+              <w:t>Critical issue &gt;24 hrs / dissatisfaction / contract risk.</w:t>
             </w:r>
           </w:p>
         </w:tc>
         <w:tc>
           <w:tcPr>
-            <w:tcW w:type="dxa" w:w="1872"/>
+            <w:tcW w:type="dxa" w:w="2304"/>
           </w:tcPr>
           <w:p>
             <w:r/>
             <w:r>
               <w:rPr>
                 <w:b w:val="0"/>
-                <w:sz w:val="21"/>
+                <w:sz w:val="20"/>
               </w:rPr>
-              <w:t>[1 business day]</w:t>
+              <w:t>Gavin Byrne, COO.</w:t>
             </w:r>
           </w:p>
         </w:tc>
         <w:tc>
           <w:tcPr>
-            <w:tcW w:type="dxa" w:w="1872"/>
+            <w:tcW w:type="dxa" w:w="2448"/>
           </w:tcPr>
           <w:p>
             <w:r/>
             <w:r>
               <w:rPr>
                 <w:b w:val="0"/>
-                <w:sz w:val="21"/>
+                <w:sz w:val="20"/>
               </w:rPr>
-              <w:t>[5 business days]</w:t>
+              <w:t>Executive intervention and commercial authority; personal contact with the SOLAS point of contact.</w:t>
             </w:r>
           </w:p>
         </w:tc>
@@ -2380,64 +3710,7 @@
     </w:tbl>
     <w:p>
       <w:r>
-        <w:rPr>
-          <w:i/>
-          <w:color w:val="C00000"/>
-        </w:rPr>
-        <w:t>[Adjust SLA targets to match the levels committed in your TCD response / standard support contract.]</w:t>
-      </w:r>
-    </w:p>
-    <w:p>
-      <w:pPr>
-        <w:pStyle w:val="Heading2"/>
-      </w:pPr>
-      <w:r>
-        <w:t>3.4  Maintenance</w:t>
-      </w:r>
-    </w:p>
-    <w:p>
-      <w:r>
-        <w:t>To keep the AV estate reliable, secure and consistent across all rooms, we provide a planned preventative maintenance (PPM) regime alongside reactive support:</w:t>
-      </w:r>
-    </w:p>
-    <w:p>
-      <w:pPr>
-        <w:pStyle w:val="ListBullet"/>
-      </w:pPr>
-      <w:r>
-        <w:t>Scheduled PPM visits [e.g. twice yearly] covering inspection, cleaning, connection checks and performance verification of every room.</w:t>
-      </w:r>
-    </w:p>
-    <w:p>
-      <w:pPr>
-        <w:pStyle w:val="ListBullet"/>
-      </w:pPr>
-      <w:r>
-        <w:t>Proactive remote monitoring of connected devices to identify and address issues before they affect users, where supported.</w:t>
-      </w:r>
-    </w:p>
-    <w:p>
-      <w:pPr>
-        <w:pStyle w:val="ListBullet"/>
-      </w:pPr>
-      <w:r>
-        <w:t>Firmware and software updates applied in a controlled manner to maintain security, compatibility with Microsoft Teams/365, and standardisation.</w:t>
-      </w:r>
-    </w:p>
-    <w:p>
-      <w:pPr>
-        <w:pStyle w:val="ListBullet"/>
-      </w:pPr>
-      <w:r>
-        <w:t>Maintenance of an asset register and service history for all installed equipment.</w:t>
-      </w:r>
-    </w:p>
-    <w:p>
-      <w:pPr>
-        <w:pStyle w:val="ListBullet"/>
-      </w:pPr>
-      <w:r>
-        <w:t>Recommendations for technology refresh and lifecycle management over the contract term.</w:t>
+        <w:t>Contract management is overseen by the Account Manager, Michael Koulis, who holds review meetings with SOLAS on a quarterly basis (or more frequently if SOLAS prefers). Each review covers performance against KPIs (response times, fix times, ticket volumes, remote-fix rate and CSAT), open-ticket and ageing analysis, PM progress and findings, recurring faults and recommended upgrades, and a forward look. An action register with named owners and due dates is issued after each review and tracked live in ConnectWise.</w:t>
       </w:r>
     </w:p>
     <w:p>
@@ -2446,288 +3719,7 @@
           <w:i/>
           <w:color w:val="C00000"/>
         </w:rPr>
-        <w:t>[Confirm PPM frequency and whether remote monitoring is included in the base offer.]</w:t>
-      </w:r>
-    </w:p>
-    <w:p>
-      <w:pPr>
-        <w:pStyle w:val="Heading2"/>
-      </w:pPr>
-      <w:r>
-        <w:t>3.5  Escalation Process</w:t>
-      </w:r>
-    </w:p>
-    <w:p>
-      <w:r>
-        <w:t>Where an incident is not progressing within SLA, or SOLAS wishes to raise a concern, a clear tiered escalation path ensures rapid attention from increasingly senior staff:</w:t>
-      </w:r>
-    </w:p>
-    <w:tbl>
-      <w:tblPr>
-        <w:tblStyle w:val="TableGrid"/>
-        <w:tblW w:type="auto" w:w="0"/>
-        <w:jc w:val="center"/>
-        <w:tblLook w:firstColumn="1" w:firstRow="1" w:lastColumn="0" w:lastRow="0" w:noHBand="0" w:noVBand="1" w:val="04A0"/>
-      </w:tblPr>
-      <w:tblGrid>
-        <w:gridCol w:w="2880"/>
-        <w:gridCol w:w="2880"/>
-        <w:gridCol w:w="2880"/>
-      </w:tblGrid>
-      <w:tr>
-        <w:tc>
-          <w:tcPr>
-            <w:tcW w:type="dxa" w:w="1440"/>
-            <w:shd w:val="clear" w:fill="1F3364"/>
-          </w:tcPr>
-          <w:p>
-            <w:r/>
-            <w:r>
-              <w:rPr>
-                <w:b/>
-                <w:color w:val="FFFFFF"/>
-                <w:sz w:val="21"/>
-              </w:rPr>
-              <w:t>Level</w:t>
-            </w:r>
-          </w:p>
-        </w:tc>
-        <w:tc>
-          <w:tcPr>
-            <w:tcW w:type="dxa" w:w="3168"/>
-            <w:shd w:val="clear" w:fill="1F3364"/>
-          </w:tcPr>
-          <w:p>
-            <w:r/>
-            <w:r>
-              <w:rPr>
-                <w:b/>
-                <w:color w:val="FFFFFF"/>
-                <w:sz w:val="21"/>
-              </w:rPr>
-              <w:t>Owner</w:t>
-            </w:r>
-          </w:p>
-        </w:tc>
-        <w:tc>
-          <w:tcPr>
-            <w:tcW w:type="dxa" w:w="4752"/>
-            <w:shd w:val="clear" w:fill="1F3364"/>
-          </w:tcPr>
-          <w:p>
-            <w:r/>
-            <w:r>
-              <w:rPr>
-                <w:b/>
-                <w:color w:val="FFFFFF"/>
-                <w:sz w:val="21"/>
-              </w:rPr>
-              <w:t>Trigger / Role</w:t>
-            </w:r>
-          </w:p>
-        </w:tc>
-      </w:tr>
-      <w:tr>
-        <w:tc>
-          <w:tcPr>
-            <w:tcW w:type="dxa" w:w="1440"/>
-          </w:tcPr>
-          <w:p>
-            <w:r/>
-            <w:r>
-              <w:rPr>
-                <w:b w:val="0"/>
-                <w:sz w:val="21"/>
-              </w:rPr>
-              <w:t>Level 1</w:t>
-            </w:r>
-          </w:p>
-        </w:tc>
-        <w:tc>
-          <w:tcPr>
-            <w:tcW w:type="dxa" w:w="3168"/>
-          </w:tcPr>
-          <w:p>
-            <w:r/>
-            <w:r>
-              <w:rPr>
-                <w:b w:val="0"/>
-                <w:sz w:val="21"/>
-              </w:rPr>
-              <w:t>Service Desk Analyst</w:t>
-            </w:r>
-          </w:p>
-        </w:tc>
-        <w:tc>
-          <w:tcPr>
-            <w:tcW w:type="dxa" w:w="4752"/>
-          </w:tcPr>
-          <w:p>
-            <w:r/>
-            <w:r>
-              <w:rPr>
-                <w:b w:val="0"/>
-                <w:sz w:val="21"/>
-              </w:rPr>
-              <w:t>Initial logging, triage and resolution of the incident.</w:t>
-            </w:r>
-          </w:p>
-        </w:tc>
-      </w:tr>
-      <w:tr>
-        <w:tc>
-          <w:tcPr>
-            <w:tcW w:type="dxa" w:w="1440"/>
-          </w:tcPr>
-          <w:p>
-            <w:r/>
-            <w:r>
-              <w:rPr>
-                <w:b w:val="0"/>
-                <w:sz w:val="21"/>
-              </w:rPr>
-              <w:t>Level 2</w:t>
-            </w:r>
-          </w:p>
-        </w:tc>
-        <w:tc>
-          <w:tcPr>
-            <w:tcW w:type="dxa" w:w="3168"/>
-          </w:tcPr>
-          <w:p>
-            <w:r/>
-            <w:r>
-              <w:rPr>
-                <w:b w:val="0"/>
-                <w:sz w:val="21"/>
-              </w:rPr>
-              <w:t>Lead Engineer / Service Desk Lead</w:t>
-            </w:r>
-          </w:p>
-        </w:tc>
-        <w:tc>
-          <w:tcPr>
-            <w:tcW w:type="dxa" w:w="4752"/>
-          </w:tcPr>
-          <w:p>
-            <w:r/>
-            <w:r>
-              <w:rPr>
-                <w:b w:val="0"/>
-                <w:sz w:val="21"/>
-              </w:rPr>
-              <w:t>Technical escalation; SLA at risk; complex faults.</w:t>
-            </w:r>
-          </w:p>
-        </w:tc>
-      </w:tr>
-      <w:tr>
-        <w:tc>
-          <w:tcPr>
-            <w:tcW w:type="dxa" w:w="1440"/>
-          </w:tcPr>
-          <w:p>
-            <w:r/>
-            <w:r>
-              <w:rPr>
-                <w:b w:val="0"/>
-                <w:sz w:val="21"/>
-              </w:rPr>
-              <w:t>Level 3</w:t>
-            </w:r>
-          </w:p>
-        </w:tc>
-        <w:tc>
-          <w:tcPr>
-            <w:tcW w:type="dxa" w:w="3168"/>
-          </w:tcPr>
-          <w:p>
-            <w:r/>
-            <w:r>
-              <w:rPr>
-                <w:b w:val="0"/>
-                <w:sz w:val="21"/>
-              </w:rPr>
-              <w:t>Account / Contract Manager</w:t>
-            </w:r>
-          </w:p>
-        </w:tc>
-        <w:tc>
-          <w:tcPr>
-            <w:tcW w:type="dxa" w:w="4752"/>
-          </w:tcPr>
-          <w:p>
-            <w:r/>
-            <w:r>
-              <w:rPr>
-                <w:b w:val="0"/>
-                <w:sz w:val="21"/>
-              </w:rPr>
-              <w:t>SLA breach, recurring issues, or SOLAS-raised concern.</w:t>
-            </w:r>
-          </w:p>
-        </w:tc>
-      </w:tr>
-      <w:tr>
-        <w:tc>
-          <w:tcPr>
-            <w:tcW w:type="dxa" w:w="1440"/>
-          </w:tcPr>
-          <w:p>
-            <w:r/>
-            <w:r>
-              <w:rPr>
-                <w:b w:val="0"/>
-                <w:sz w:val="21"/>
-              </w:rPr>
-              <w:t>Level 4</w:t>
-            </w:r>
-          </w:p>
-        </w:tc>
-        <w:tc>
-          <w:tcPr>
-            <w:tcW w:type="dxa" w:w="3168"/>
-          </w:tcPr>
-          <w:p>
-            <w:r/>
-            <w:r>
-              <w:rPr>
-                <w:b w:val="0"/>
-                <w:sz w:val="21"/>
-              </w:rPr>
-              <w:t>[Senior Manager / Director]</w:t>
-            </w:r>
-          </w:p>
-        </w:tc>
-        <w:tc>
-          <w:tcPr>
-            <w:tcW w:type="dxa" w:w="4752"/>
-          </w:tcPr>
-          <w:p>
-            <w:r/>
-            <w:r>
-              <w:rPr>
-                <w:b w:val="0"/>
-                <w:sz w:val="21"/>
-              </w:rPr>
-              <w:t>Unresolved escalations or major service issues.</w:t>
-            </w:r>
-          </w:p>
-        </w:tc>
-      </w:tr>
-    </w:tbl>
-    <w:p>
-      <w:r>
-        <w:t>Escalation contacts, including names and direct contact details, will be provided at handover and kept current throughout the contract. For incidents affecting a live SOLAS event, escalation is automatic and immediate.</w:t>
-      </w:r>
-    </w:p>
-    <w:p>
-      <w:r>
-        <w:rPr>
-          <w:i/>
-          <w:color w:val="C00000"/>
-        </w:rPr>
-        <w:t>[Insert named escalation contacts and direct numbers.]</w:t>
+        <w:t>[Insert named escalation contacts and direct numbers at handover.]</w:t>
       </w:r>
     </w:p>
     <w:sectPr>
@@ -3104,7 +4096,7 @@
     <w:qFormat/>
     <w:rsid w:val="00FC693F"/>
     <w:pPr>
-      <w:spacing w:after="120" w:line="276" w:lineRule="auto"/>
+      <w:spacing w:after="120" w:line="269" w:lineRule="auto"/>
     </w:pPr>
     <w:rPr>
       <w:rFonts w:ascii="Calibri" w:hAnsi="Calibri"/>

</xml_diff>